<commit_message>
added research on earth modelling
</commit_message>
<xml_diff>
--- a/docs/A Mathematical Model for Determining the Five Daily Islamic Prayer Times.docx
+++ b/docs/A Mathematical Model for Determining the Five Daily Islamic Prayer Times.docx
@@ -14,9 +14,53 @@
     <w:p/>
     <w:p>
       <w:pPr>
+        <w:jc w:val="center"/>
+      </w:pPr>
+      <w:r>
+        <w:t>draft research paper</w:t>
+      </w:r>
+    </w:p>
+    <w:p>
+      <w:pPr>
+        <w:jc w:val="center"/>
+      </w:pPr>
+    </w:p>
+    <w:p>
+      <w:pPr>
+        <w:jc w:val="center"/>
+      </w:pPr>
+      <w:r>
+        <w:t>Raeid Usmanali</w:t>
+      </w:r>
+    </w:p>
+    <w:p>
+      <w:pPr>
+        <w:jc w:val="center"/>
+      </w:pPr>
+      <w:r>
+        <w:t>October 26, 2026</w:t>
+      </w:r>
+    </w:p>
+    <w:p/>
+    <w:p>
+      <w:pPr>
+        <w:rPr>
+          <w:rFonts w:asciiTheme="majorHAnsi" w:eastAsiaTheme="majorEastAsia" w:hAnsiTheme="majorHAnsi" w:cstheme="majorBidi"/>
+          <w:color w:val="0F4761" w:themeColor="accent1" w:themeShade="BF"/>
+          <w:sz w:val="40"/>
+          <w:szCs w:val="40"/>
+        </w:rPr>
+      </w:pPr>
+      <w:r>
+        <w:br w:type="page"/>
+      </w:r>
+    </w:p>
+    <w:p>
+      <w:pPr>
         <w:pStyle w:val="Heading1"/>
       </w:pPr>
       <w:r>
+        <w:lastRenderedPageBreak/>
         <w:t>Introduction and Scope</w:t>
       </w:r>
     </w:p>
@@ -25,527 +69,528 @@
         <w:t>In this document, I plan to go over the evidence, interpretation, observation, astronomical condition, and equation for calculating the entrance time for each of the five daily prayers within the Islamic Faith.</w:t>
       </w:r>
     </w:p>
+    <w:p>
+      <w:r>
+        <w:t>…</w:t>
+      </w:r>
+    </w:p>
+    <w:p>
+      <w:pPr>
+        <w:pStyle w:val="Heading1"/>
+      </w:pPr>
+      <w:r>
+        <w:t>Mathematical Understanding</w:t>
+      </w:r>
+    </w:p>
+    <w:p>
+      <w:pPr>
+        <w:pStyle w:val="Heading2"/>
+      </w:pPr>
+      <w:r>
+        <w:t>Geographic Coordinate Systems and Conventions</w:t>
+      </w:r>
+    </w:p>
+    <w:p>
+      <w:pPr>
+        <w:pStyle w:val="ListParagraph"/>
+        <w:numPr>
+          <w:ilvl w:val="0"/>
+          <w:numId w:val="3"/>
+        </w:numPr>
+      </w:pPr>
+      <w:r>
+        <w:t>Establish where the observer is located on Earth</w:t>
+      </w:r>
+    </w:p>
+    <w:p>
+      <w:pPr>
+        <w:pStyle w:val="ListParagraph"/>
+        <w:numPr>
+          <w:ilvl w:val="1"/>
+          <w:numId w:val="3"/>
+        </w:numPr>
+      </w:pPr>
+      <w:r>
+        <w:t>How we represent that position mathematically</w:t>
+      </w:r>
+    </w:p>
+    <w:p>
+      <w:pPr>
+        <w:pStyle w:val="ListParagraph"/>
+        <w:numPr>
+          <w:ilvl w:val="0"/>
+          <w:numId w:val="3"/>
+        </w:numPr>
+      </w:pPr>
+      <w:r>
+        <w:t>How to establish a sense of direction</w:t>
+      </w:r>
+    </w:p>
+    <w:p>
+      <w:pPr>
+        <w:pStyle w:val="ListParagraph"/>
+        <w:numPr>
+          <w:ilvl w:val="1"/>
+          <w:numId w:val="3"/>
+        </w:numPr>
+      </w:pPr>
+      <w:r>
+        <w:t>Reference direction specifically for solar angles</w:t>
+      </w:r>
+    </w:p>
+    <w:p>
+      <w:pPr>
+        <w:pStyle w:val="ListParagraph"/>
+        <w:numPr>
+          <w:ilvl w:val="0"/>
+          <w:numId w:val="3"/>
+        </w:numPr>
+      </w:pPr>
+      <w:r>
+        <w:t xml:space="preserve">Before we can determine the Sun’s position relative to an observer, we need to define the observer’s position in a </w:t>
+      </w:r>
+      <w:r>
+        <w:t xml:space="preserve">consistent (and mathematically </w:t>
+      </w:r>
+      <w:proofErr w:type="spellStart"/>
+      <w:r>
+        <w:t>sound) coordinate</w:t>
+      </w:r>
+      <w:proofErr w:type="spellEnd"/>
+      <w:r>
+        <w:t xml:space="preserve"> system</w:t>
+      </w:r>
+    </w:p>
+    <w:p>
+      <w:pPr>
+        <w:pStyle w:val="Heading3"/>
+      </w:pPr>
+      <w:r>
+        <w:t>Modelling the Earth</w:t>
+      </w:r>
+    </w:p>
+    <w:p>
+      <w:pPr>
+        <w:pStyle w:val="ListParagraph"/>
+        <w:numPr>
+          <w:ilvl w:val="0"/>
+          <w:numId w:val="3"/>
+        </w:numPr>
+      </w:pPr>
+      <w:r>
+        <w:t>Inputs are latitude and longitude</w:t>
+      </w:r>
+    </w:p>
+    <w:p>
+      <w:pPr>
+        <w:pStyle w:val="ListParagraph"/>
+        <w:numPr>
+          <w:ilvl w:val="0"/>
+          <w:numId w:val="3"/>
+        </w:numPr>
+      </w:pPr>
+      <w:r>
+        <w:t>These coordinates only make sense relative to model of the Earth’s shape</w:t>
+      </w:r>
+    </w:p>
+    <w:p>
+      <w:pPr>
+        <w:pStyle w:val="ListParagraph"/>
+        <w:numPr>
+          <w:ilvl w:val="0"/>
+          <w:numId w:val="3"/>
+        </w:numPr>
+      </w:pPr>
+      <w:r>
+        <w:t>If the earth as a perfect sphere, every point on the surface would lie and equal distance R from the Earth’s center</w:t>
+      </w:r>
+    </w:p>
+    <w:p>
+      <w:pPr>
+        <w:pStyle w:val="ListParagraph"/>
+        <w:numPr>
+          <w:ilvl w:val="0"/>
+          <w:numId w:val="3"/>
+        </w:numPr>
+      </w:pPr>
+      <w:r>
+        <w:t>The Earth is not perfectly spherical</w:t>
+      </w:r>
+    </w:p>
+    <w:p>
+      <w:pPr>
+        <w:pStyle w:val="ListParagraph"/>
+        <w:numPr>
+          <w:ilvl w:val="1"/>
+          <w:numId w:val="3"/>
+        </w:numPr>
+      </w:pPr>
+      <w:r>
+        <w:t>Closest approximation is an “oblate spheroid”</w:t>
+      </w:r>
+    </w:p>
+    <w:p>
+      <w:pPr>
+        <w:pStyle w:val="ListParagraph"/>
+        <w:numPr>
+          <w:ilvl w:val="2"/>
+          <w:numId w:val="3"/>
+        </w:numPr>
+      </w:pPr>
+      <w:r>
+        <w:t xml:space="preserve">Oblate Spheroid is a sphere flattened slightly at the poles and wider around the equator. This is </w:t>
+      </w:r>
+      <w:proofErr w:type="gramStart"/>
+      <w:r>
+        <w:t>due to the effect</w:t>
+      </w:r>
+      <w:proofErr w:type="gramEnd"/>
+      <w:r>
+        <w:t xml:space="preserve"> of gravity </w:t>
+      </w:r>
+      <w:r>
+        <w:t>on the Earth</w:t>
+      </w:r>
+      <w:r>
+        <w:t xml:space="preserve"> </w:t>
+      </w:r>
+    </w:p>
+    <w:p>
+      <w:r>
+        <w:lastRenderedPageBreak/>
+        <w:drawing>
+          <wp:inline distT="0" distB="0" distL="0" distR="0" wp14:anchorId="270F9BE1" wp14:editId="2BB9DDC8">
+            <wp:extent cx="5943600" cy="2992755"/>
+            <wp:effectExtent l="0" t="0" r="0" b="4445"/>
+            <wp:docPr id="280064823" name="Picture 1"/>
+            <wp:cNvGraphicFramePr>
+              <a:graphicFrameLocks xmlns:a="http://schemas.openxmlformats.org/drawingml/2006/main" noChangeAspect="1"/>
+            </wp:cNvGraphicFramePr>
+            <a:graphic xmlns:a="http://schemas.openxmlformats.org/drawingml/2006/main">
+              <a:graphicData uri="http://schemas.openxmlformats.org/drawingml/2006/picture">
+                <pic:pic xmlns:pic="http://schemas.openxmlformats.org/drawingml/2006/picture">
+                  <pic:nvPicPr>
+                    <pic:cNvPr id="280064823" name=""/>
+                    <pic:cNvPicPr/>
+                  </pic:nvPicPr>
+                  <pic:blipFill>
+                    <a:blip r:embed="rId8"/>
+                    <a:stretch>
+                      <a:fillRect/>
+                    </a:stretch>
+                  </pic:blipFill>
+                  <pic:spPr>
+                    <a:xfrm>
+                      <a:off x="0" y="0"/>
+                      <a:ext cx="5943600" cy="2992755"/>
+                    </a:xfrm>
+                    <a:prstGeom prst="rect">
+                      <a:avLst/>
+                    </a:prstGeom>
+                  </pic:spPr>
+                </pic:pic>
+              </a:graphicData>
+            </a:graphic>
+          </wp:inline>
+        </w:drawing>
+      </w:r>
+    </w:p>
+    <w:p>
+      <w:pPr>
+        <w:pStyle w:val="ListParagraph"/>
+        <w:numPr>
+          <w:ilvl w:val="0"/>
+          <w:numId w:val="3"/>
+        </w:numPr>
+      </w:pPr>
+      <w:r>
+        <w:t>For the sake of our model, we define</w:t>
+      </w:r>
+    </w:p>
+    <w:p>
+      <w:pPr>
+        <w:pStyle w:val="ListParagraph"/>
+        <w:numPr>
+          <w:ilvl w:val="1"/>
+          <w:numId w:val="3"/>
+        </w:numPr>
+      </w:pPr>
+      <w:r>
+        <w:t>a: equatorial semi-major axis</w:t>
+      </w:r>
+    </w:p>
+    <w:p>
+      <w:pPr>
+        <w:pStyle w:val="ListParagraph"/>
+        <w:numPr>
+          <w:ilvl w:val="1"/>
+          <w:numId w:val="3"/>
+        </w:numPr>
+      </w:pPr>
+      <w:r>
+        <w:t>b: polar semi-minor axis</w:t>
+      </w:r>
+    </w:p>
+    <w:p>
+      <w:pPr>
+        <w:pStyle w:val="ListParagraph"/>
+        <w:numPr>
+          <w:ilvl w:val="1"/>
+          <w:numId w:val="3"/>
+        </w:numPr>
+      </w:pPr>
+      <w:r>
+        <w:t>f: flattening factor</w:t>
+      </w:r>
+    </w:p>
+    <w:p>
+      <w:pPr>
+        <w:pStyle w:val="ListParagraph"/>
+        <w:numPr>
+          <w:ilvl w:val="1"/>
+          <w:numId w:val="3"/>
+        </w:numPr>
+      </w:pPr>
+      <w:r>
+        <w:t>f = (a-b)/a</w:t>
+      </w:r>
+    </w:p>
+    <w:p>
+      <w:pPr>
+        <w:pStyle w:val="ListParagraph"/>
+        <w:numPr>
+          <w:ilvl w:val="1"/>
+          <w:numId w:val="3"/>
+        </w:numPr>
+      </w:pPr>
+      <w:r>
+        <w:t>Note that this quantifies how far the Earth departs from the perfect spherical model. If a = b, then f = 0</w:t>
+      </w:r>
+    </w:p>
+    <w:p>
+      <w:pPr>
+        <w:pStyle w:val="ListParagraph"/>
+        <w:numPr>
+          <w:ilvl w:val="0"/>
+          <w:numId w:val="3"/>
+        </w:numPr>
+      </w:pPr>
+      <w:r>
+        <w:t>For our model, we will adopt the World Geodetic System 1984 (WGS 84) which defines:</w:t>
+      </w:r>
+    </w:p>
+    <w:p>
+      <w:pPr>
+        <w:pStyle w:val="ListParagraph"/>
+        <w:numPr>
+          <w:ilvl w:val="1"/>
+          <w:numId w:val="3"/>
+        </w:numPr>
+      </w:pPr>
+      <w:r>
+        <w:t xml:space="preserve">Equatorial semi-major axis </w:t>
+      </w:r>
+      <w:r>
+        <w:t xml:space="preserve">(a) - </w:t>
+      </w:r>
+      <w:r>
+        <w:t>6,378,137 m</w:t>
+      </w:r>
+    </w:p>
+    <w:p>
+      <w:pPr>
+        <w:pStyle w:val="ListParagraph"/>
+        <w:numPr>
+          <w:ilvl w:val="1"/>
+          <w:numId w:val="3"/>
+        </w:numPr>
+      </w:pPr>
+      <w:r>
+        <w:t xml:space="preserve">Inverse flattening </w:t>
+      </w:r>
+      <w:r>
+        <w:t xml:space="preserve">(1/f) - </w:t>
+      </w:r>
+      <w:r>
+        <w:t>298.257223563</w:t>
+      </w:r>
+    </w:p>
+    <w:p>
+      <w:pPr>
+        <w:pStyle w:val="ListParagraph"/>
+        <w:numPr>
+          <w:ilvl w:val="1"/>
+          <w:numId w:val="3"/>
+        </w:numPr>
+      </w:pPr>
+      <w:r>
+        <w:t xml:space="preserve">Polar semi-minor axis </w:t>
+      </w:r>
+      <w:r>
+        <w:t xml:space="preserve">(b) - </w:t>
+      </w:r>
+      <w:r>
+        <w:t>≈ 6,356,752.314 m</w:t>
+      </w:r>
+    </w:p>
+    <w:p>
+      <w:pPr>
+        <w:pStyle w:val="ListParagraph"/>
+        <w:numPr>
+          <w:ilvl w:val="0"/>
+          <w:numId w:val="3"/>
+        </w:numPr>
+      </w:pPr>
+      <w:r>
+        <w:t>Note that compared to the SPA, Reda and Andreas account for flattening when calculating the Sun’s topocentric position. The SPA constants vary slightly from the exact WGS 84 parameters</w:t>
+      </w:r>
+    </w:p>
+    <w:p>
+      <w:r>
+        <w:rPr>
+          <w:noProof/>
+        </w:rPr>
+        <w:lastRenderedPageBreak/>
+        <w:drawing>
+          <wp:inline distT="0" distB="0" distL="0" distR="0" wp14:anchorId="6D5238BF" wp14:editId="54E63448">
+            <wp:extent cx="4241770" cy="4337050"/>
+            <wp:effectExtent l="0" t="0" r="635" b="0"/>
+            <wp:docPr id="526320669" name="Picture 1"/>
+            <wp:cNvGraphicFramePr>
+              <a:graphicFrameLocks xmlns:a="http://schemas.openxmlformats.org/drawingml/2006/main" noChangeAspect="1"/>
+            </wp:cNvGraphicFramePr>
+            <a:graphic xmlns:a="http://schemas.openxmlformats.org/drawingml/2006/main">
+              <a:graphicData uri="http://schemas.openxmlformats.org/drawingml/2006/picture">
+                <pic:pic xmlns:pic="http://schemas.openxmlformats.org/drawingml/2006/picture">
+                  <pic:nvPicPr>
+                    <pic:cNvPr id="526320669" name="Picture 526320669"/>
+                    <pic:cNvPicPr/>
+                  </pic:nvPicPr>
+                  <pic:blipFill rotWithShape="1">
+                    <a:blip r:embed="rId9">
+                      <a:extLst>
+                        <a:ext uri="{28A0092B-C50C-407E-A947-70E740481C1C}">
+                          <a14:useLocalDpi xmlns:a14="http://schemas.microsoft.com/office/drawing/2010/main" val="0"/>
+                        </a:ext>
+                      </a:extLst>
+                    </a:blip>
+                    <a:srcRect l="14213" t="1264" r="14383" b="1392"/>
+                    <a:stretch>
+                      <a:fillRect/>
+                    </a:stretch>
+                  </pic:blipFill>
+                  <pic:spPr bwMode="auto">
+                    <a:xfrm>
+                      <a:off x="0" y="0"/>
+                      <a:ext cx="4241770" cy="4337050"/>
+                    </a:xfrm>
+                    <a:prstGeom prst="rect">
+                      <a:avLst/>
+                    </a:prstGeom>
+                    <a:ln>
+                      <a:noFill/>
+                    </a:ln>
+                    <a:extLst>
+                      <a:ext uri="{53640926-AAD7-44D8-BBD7-CCE9431645EC}">
+                        <a14:shadowObscured xmlns:a14="http://schemas.microsoft.com/office/drawing/2010/main"/>
+                      </a:ext>
+                    </a:extLst>
+                  </pic:spPr>
+                </pic:pic>
+              </a:graphicData>
+            </a:graphic>
+          </wp:inline>
+        </w:drawing>
+      </w:r>
+    </w:p>
     <w:p/>
     <w:p>
       <w:pPr>
+        <w:pStyle w:val="Heading3"/>
+      </w:pPr>
+      <w:r>
+        <w:t>Latitude and Longitude</w:t>
+      </w:r>
+    </w:p>
+    <w:p/>
+    <w:p>
+      <w:pPr>
         <w:pStyle w:val="Heading1"/>
       </w:pPr>
       <w:r>
-        <w:t>Fundamental Mathematical Understanding</w:t>
-      </w:r>
-    </w:p>
-    <w:p>
-      <w:r>
-        <w:t>For much of this document we will be operating on the goal of finding the instan</w:t>
-      </w:r>
-      <w:r>
-        <w:t>t</w:t>
-      </w:r>
-      <w:r>
-        <w:t xml:space="preserve"> at which the Sun attains a particular altitude above or below the horizon.</w:t>
-      </w:r>
-    </w:p>
-    <w:p>
-      <w:r>
-        <w:t xml:space="preserve">[insert image or diagram here – Show latitude and longitude on the earth with a </w:t>
+        <w:t>Islamic Orientation</w:t>
+      </w:r>
+    </w:p>
+    <w:p/>
+    <w:p>
+      <w:r>
+        <w:t>Fajr - Begins at (Fajr al-Sadiq), which is marked by a white or faint horizontal band of light spreading across the eastern horizon. Ends strictly at sunrise (Shuruq)</w:t>
+      </w:r>
+    </w:p>
+    <w:p>
+      <w:proofErr w:type="spellStart"/>
+      <w:r>
+        <w:t>Dhuhr</w:t>
+      </w:r>
+      <w:proofErr w:type="spellEnd"/>
+      <w:r>
+        <w:t xml:space="preserve"> </w:t>
       </w:r>
       <w:proofErr w:type="gramStart"/>
       <w:r>
-        <w:t>360 degree</w:t>
+        <w:t>-  It</w:t>
       </w:r>
       <w:proofErr w:type="gramEnd"/>
       <w:r>
-        <w:t xml:space="preserve"> compass showing the position of the sun]</w:t>
-      </w:r>
-    </w:p>
-    <w:p>
-      <w:pPr>
-        <w:rPr>
-          <w:rFonts w:eastAsiaTheme="minorEastAsia"/>
-        </w:rPr>
-      </w:pPr>
-      <w:r>
-        <w:t>Let:</w:t>
-      </w:r>
-    </w:p>
-    <w:tbl>
-      <w:tblPr>
-        <w:tblStyle w:val="TableGrid"/>
-        <w:tblW w:w="0" w:type="auto"/>
-        <w:tblLook w:val="04A0" w:firstRow="1" w:lastRow="0" w:firstColumn="1" w:lastColumn="0" w:noHBand="0" w:noVBand="1"/>
-      </w:tblPr>
-      <w:tblGrid>
-        <w:gridCol w:w="4675"/>
-        <w:gridCol w:w="4675"/>
-      </w:tblGrid>
-      <w:tr>
-        <w:tc>
-          <w:tcPr>
-            <w:tcW w:w="4675" w:type="dxa"/>
-          </w:tcPr>
-          <w:p>
-            <w:pPr>
-              <w:rPr>
-                <w:rFonts w:eastAsiaTheme="minorEastAsia"/>
-              </w:rPr>
-            </w:pPr>
-            <m:oMathPara>
-              <m:oMath>
-                <m:r>
-                  <w:rPr>
-                    <w:rFonts w:ascii="Cambria Math" w:eastAsiaTheme="minorEastAsia" w:hAnsi="Cambria Math"/>
-                  </w:rPr>
-                  <m:t>ϕ</m:t>
-                </m:r>
-              </m:oMath>
-            </m:oMathPara>
-          </w:p>
-        </w:tc>
-        <w:tc>
-          <w:tcPr>
-            <w:tcW w:w="4675" w:type="dxa"/>
-          </w:tcPr>
-          <w:p>
-            <w:pPr>
-              <w:rPr>
-                <w:rFonts w:eastAsiaTheme="minorEastAsia"/>
-              </w:rPr>
-            </w:pPr>
-            <w:r>
-              <w:rPr>
-                <w:rFonts w:eastAsiaTheme="minorEastAsia"/>
-              </w:rPr>
-              <w:t>Geographic latitude</w:t>
-            </w:r>
-          </w:p>
-        </w:tc>
-      </w:tr>
-      <w:tr>
-        <w:tc>
-          <w:tcPr>
-            <w:tcW w:w="4675" w:type="dxa"/>
-          </w:tcPr>
-          <w:p>
-            <w:pPr>
-              <w:rPr>
-                <w:rFonts w:eastAsiaTheme="minorEastAsia"/>
-              </w:rPr>
-            </w:pPr>
-            <m:oMathPara>
-              <m:oMath>
-                <m:r>
-                  <w:rPr>
-                    <w:rFonts w:ascii="Cambria Math" w:hAnsi="Cambria Math"/>
-                  </w:rPr>
-                  <m:t>λ</m:t>
-                </m:r>
-              </m:oMath>
-            </m:oMathPara>
-          </w:p>
-        </w:tc>
-        <w:tc>
-          <w:tcPr>
-            <w:tcW w:w="4675" w:type="dxa"/>
-          </w:tcPr>
-          <w:p>
-            <w:pPr>
-              <w:rPr>
-                <w:rFonts w:eastAsiaTheme="minorEastAsia"/>
-              </w:rPr>
-            </w:pPr>
-            <w:r>
-              <w:rPr>
-                <w:rFonts w:eastAsiaTheme="minorEastAsia"/>
-              </w:rPr>
-              <w:t>Geographic longitude</w:t>
-            </w:r>
-          </w:p>
-        </w:tc>
-      </w:tr>
-      <w:tr>
-        <w:tc>
-          <w:tcPr>
-            <w:tcW w:w="4675" w:type="dxa"/>
-          </w:tcPr>
-          <w:p>
-            <w:pPr>
-              <w:rPr>
-                <w:rFonts w:eastAsiaTheme="minorEastAsia"/>
-              </w:rPr>
-            </w:pPr>
-            <m:oMathPara>
-              <m:oMath>
-                <m:r>
-                  <w:rPr>
-                    <w:rFonts w:ascii="Cambria Math" w:hAnsi="Cambria Math"/>
-                  </w:rPr>
-                  <m:t>δ</m:t>
-                </m:r>
-                <m:d>
-                  <m:dPr>
-                    <m:ctrlPr>
-                      <w:rPr>
-                        <w:rFonts w:ascii="Cambria Math" w:hAnsi="Cambria Math"/>
-                      </w:rPr>
-                    </m:ctrlPr>
-                  </m:dPr>
-                  <m:e>
-                    <m:r>
-                      <w:rPr>
-                        <w:rFonts w:ascii="Cambria Math" w:hAnsi="Cambria Math"/>
-                      </w:rPr>
-                      <m:t>t</m:t>
-                    </m:r>
-                  </m:e>
-                </m:d>
-              </m:oMath>
-            </m:oMathPara>
-          </w:p>
-        </w:tc>
-        <w:tc>
-          <w:tcPr>
-            <w:tcW w:w="4675" w:type="dxa"/>
-          </w:tcPr>
-          <w:p>
-            <w:pPr>
-              <w:rPr>
-                <w:rFonts w:eastAsiaTheme="minorEastAsia"/>
-              </w:rPr>
-            </w:pPr>
-            <w:r>
-              <w:rPr>
-                <w:rFonts w:eastAsiaTheme="minorEastAsia"/>
-              </w:rPr>
-              <w:t>Solar declination at time t, measured in degrees or radians</w:t>
-            </w:r>
-          </w:p>
-        </w:tc>
-      </w:tr>
-      <w:tr>
-        <w:tc>
-          <w:tcPr>
-            <w:tcW w:w="4675" w:type="dxa"/>
-          </w:tcPr>
-          <w:p>
-            <w:pPr>
-              <w:rPr>
-                <w:rFonts w:eastAsiaTheme="minorEastAsia"/>
-              </w:rPr>
-            </w:pPr>
-            <m:oMathPara>
-              <m:oMath>
-                <m:r>
-                  <w:rPr>
-                    <w:rFonts w:ascii="Cambria Math" w:eastAsiaTheme="minorEastAsia" w:hAnsi="Cambria Math"/>
-                  </w:rPr>
-                  <m:t>H</m:t>
-                </m:r>
-                <m:d>
-                  <m:dPr>
-                    <m:ctrlPr>
-                      <w:rPr>
-                        <w:rFonts w:ascii="Cambria Math" w:eastAsiaTheme="minorEastAsia" w:hAnsi="Cambria Math"/>
-                      </w:rPr>
-                    </m:ctrlPr>
-                  </m:dPr>
-                  <m:e>
-                    <m:r>
-                      <w:rPr>
-                        <w:rFonts w:ascii="Cambria Math" w:eastAsiaTheme="minorEastAsia" w:hAnsi="Cambria Math"/>
-                      </w:rPr>
-                      <m:t>t</m:t>
-                    </m:r>
-                  </m:e>
-                </m:d>
-              </m:oMath>
-            </m:oMathPara>
-          </w:p>
-        </w:tc>
-        <w:tc>
-          <w:tcPr>
-            <w:tcW w:w="4675" w:type="dxa"/>
-          </w:tcPr>
-          <w:p>
-            <w:pPr>
-              <w:rPr>
-                <w:rFonts w:eastAsiaTheme="minorEastAsia"/>
-              </w:rPr>
-            </w:pPr>
-            <w:r>
-              <w:rPr>
-                <w:rFonts w:eastAsiaTheme="minorEastAsia"/>
-              </w:rPr>
-              <w:t xml:space="preserve">Solar hour angle at time t </w:t>
-            </w:r>
-          </w:p>
-        </w:tc>
-      </w:tr>
-      <w:tr>
-        <w:tc>
-          <w:tcPr>
-            <w:tcW w:w="4675" w:type="dxa"/>
-          </w:tcPr>
-          <w:p>
-            <w:pPr>
-              <w:rPr>
-                <w:rFonts w:eastAsiaTheme="minorEastAsia"/>
-              </w:rPr>
-            </w:pPr>
-            <m:oMathPara>
-              <m:oMath>
-                <m:r>
-                  <w:rPr>
-                    <w:rFonts w:ascii="Cambria Math" w:eastAsiaTheme="minorEastAsia" w:hAnsi="Cambria Math"/>
-                  </w:rPr>
-                  <m:t>h</m:t>
-                </m:r>
-                <m:d>
-                  <m:dPr>
-                    <m:ctrlPr>
-                      <w:rPr>
-                        <w:rFonts w:ascii="Cambria Math" w:eastAsiaTheme="minorEastAsia" w:hAnsi="Cambria Math"/>
-                      </w:rPr>
-                    </m:ctrlPr>
-                  </m:dPr>
-                  <m:e>
-                    <m:r>
-                      <w:rPr>
-                        <w:rFonts w:ascii="Cambria Math" w:eastAsiaTheme="minorEastAsia" w:hAnsi="Cambria Math"/>
-                      </w:rPr>
-                      <m:t>t</m:t>
-                    </m:r>
-                  </m:e>
-                </m:d>
-              </m:oMath>
-            </m:oMathPara>
-          </w:p>
-        </w:tc>
-        <w:tc>
-          <w:tcPr>
-            <w:tcW w:w="4675" w:type="dxa"/>
-          </w:tcPr>
-          <w:p>
-            <w:pPr>
-              <w:rPr>
-                <w:rFonts w:eastAsiaTheme="minorEastAsia"/>
-              </w:rPr>
-            </w:pPr>
-            <w:r>
-              <w:rPr>
-                <w:rFonts w:eastAsiaTheme="minorEastAsia"/>
-              </w:rPr>
-              <w:t>Solar altitude above the horizon at time t</w:t>
-            </w:r>
-          </w:p>
-        </w:tc>
-      </w:tr>
-    </w:tbl>
-    <w:p>
-      <w:pPr>
-        <w:rPr>
-          <w:rFonts w:eastAsiaTheme="minorEastAsia"/>
-        </w:rPr>
-      </w:pPr>
-    </w:p>
-    <w:p>
-      <w:r>
-        <w:t>The foundational equation is as follows:</w:t>
-      </w:r>
-    </w:p>
-    <w:p>
-      <m:oMathPara>
-        <m:oMath>
-          <m:r>
-            <w:rPr>
-              <w:rFonts w:ascii="Cambria Math" w:hAnsi="Cambria Math"/>
-            </w:rPr>
-            <m:t>sin</m:t>
-          </m:r>
-          <m:d>
-            <m:dPr>
-              <m:ctrlPr>
-                <w:rPr>
-                  <w:rFonts w:ascii="Cambria Math" w:hAnsi="Cambria Math"/>
-                </w:rPr>
-              </m:ctrlPr>
-            </m:dPr>
-            <m:e>
-              <m:r>
-                <w:rPr>
-                  <w:rFonts w:ascii="Cambria Math" w:hAnsi="Cambria Math"/>
-                </w:rPr>
-                <m:t>h</m:t>
-              </m:r>
-            </m:e>
-          </m:d>
-          <m:r>
-            <w:rPr>
-              <w:rFonts w:ascii="Cambria Math" w:hAnsi="Cambria Math"/>
-            </w:rPr>
-            <m:t>=</m:t>
-          </m:r>
-          <m:d>
-            <m:dPr>
-              <m:begChr m:val="["/>
-              <m:endChr m:val="]"/>
-              <m:ctrlPr>
-                <w:rPr>
-                  <w:rFonts w:ascii="Cambria Math" w:hAnsi="Cambria Math"/>
-                </w:rPr>
-              </m:ctrlPr>
-            </m:dPr>
-            <m:e>
-              <m:r>
-                <w:rPr>
-                  <w:rFonts w:ascii="Cambria Math" w:hAnsi="Cambria Math"/>
-                </w:rPr>
-                <m:t>sin</m:t>
-              </m:r>
-              <m:d>
-                <m:dPr>
-                  <m:ctrlPr>
-                    <w:rPr>
-                      <w:rFonts w:ascii="Cambria Math" w:hAnsi="Cambria Math"/>
-                    </w:rPr>
-                  </m:ctrlPr>
-                </m:dPr>
-                <m:e>
-                  <m:r>
-                    <w:rPr>
-                      <w:rFonts w:ascii="Cambria Math" w:hAnsi="Cambria Math"/>
-                    </w:rPr>
-                    <m:t>ϕ</m:t>
-                  </m:r>
-                </m:e>
-              </m:d>
-              <m:r>
-                <w:rPr>
-                  <w:rFonts w:ascii="Cambria Math" w:hAnsi="Cambria Math"/>
-                </w:rPr>
-                <m:t>*sin</m:t>
-              </m:r>
-              <m:d>
-                <m:dPr>
-                  <m:ctrlPr>
-                    <w:rPr>
-                      <w:rFonts w:ascii="Cambria Math" w:hAnsi="Cambria Math"/>
-                    </w:rPr>
-                  </m:ctrlPr>
-                </m:dPr>
-                <m:e>
-                  <m:r>
-                    <w:rPr>
-                      <w:rFonts w:ascii="Cambria Math" w:hAnsi="Cambria Math"/>
-                    </w:rPr>
-                    <m:t>δ</m:t>
-                  </m:r>
-                </m:e>
-              </m:d>
-            </m:e>
-          </m:d>
-          <m:r>
-            <w:rPr>
-              <w:rFonts w:ascii="Cambria Math" w:hAnsi="Cambria Math"/>
-            </w:rPr>
-            <m:t>+</m:t>
-          </m:r>
-          <m:d>
-            <m:dPr>
-              <m:begChr m:val="["/>
-              <m:endChr m:val="]"/>
-              <m:ctrlPr>
-                <w:rPr>
-                  <w:rFonts w:ascii="Cambria Math" w:hAnsi="Cambria Math"/>
-                </w:rPr>
-              </m:ctrlPr>
-            </m:dPr>
-            <m:e>
-              <m:r>
-                <w:rPr>
-                  <w:rFonts w:ascii="Cambria Math" w:hAnsi="Cambria Math"/>
-                </w:rPr>
-                <m:t>cos</m:t>
-              </m:r>
-              <m:d>
-                <m:dPr>
-                  <m:ctrlPr>
-                    <w:rPr>
-                      <w:rFonts w:ascii="Cambria Math" w:hAnsi="Cambria Math"/>
-                    </w:rPr>
-                  </m:ctrlPr>
-                </m:dPr>
-                <m:e>
-                  <m:r>
-                    <w:rPr>
-                      <w:rFonts w:ascii="Cambria Math" w:hAnsi="Cambria Math"/>
-                    </w:rPr>
-                    <m:t>ϕ</m:t>
-                  </m:r>
-                </m:e>
-              </m:d>
-              <m:r>
-                <w:rPr>
-                  <w:rFonts w:ascii="Cambria Math" w:hAnsi="Cambria Math"/>
-                </w:rPr>
-                <m:t>*cos</m:t>
-              </m:r>
-              <m:d>
-                <m:dPr>
-                  <m:ctrlPr>
-                    <w:rPr>
-                      <w:rFonts w:ascii="Cambria Math" w:hAnsi="Cambria Math"/>
-                    </w:rPr>
-                  </m:ctrlPr>
-                </m:dPr>
-                <m:e>
-                  <m:r>
-                    <w:rPr>
-                      <w:rFonts w:ascii="Cambria Math" w:hAnsi="Cambria Math"/>
-                    </w:rPr>
-                    <m:t>δ</m:t>
-                  </m:r>
-                </m:e>
-              </m:d>
-              <m:r>
-                <w:rPr>
-                  <w:rFonts w:ascii="Cambria Math" w:hAnsi="Cambria Math"/>
-                </w:rPr>
-                <m:t>*cos</m:t>
-              </m:r>
-              <m:d>
-                <m:dPr>
-                  <m:ctrlPr>
-                    <w:rPr>
-                      <w:rFonts w:ascii="Cambria Math" w:hAnsi="Cambria Math"/>
-                    </w:rPr>
-                  </m:ctrlPr>
-                </m:dPr>
-                <m:e>
-                  <m:r>
-                    <w:rPr>
-                      <w:rFonts w:ascii="Cambria Math" w:hAnsi="Cambria Math"/>
-                    </w:rPr>
-                    <m:t>H</m:t>
-                  </m:r>
-                </m:e>
-              </m:d>
-            </m:e>
-          </m:d>
-        </m:oMath>
-      </m:oMathPara>
-    </w:p>
-    <w:p>
-      <w:r>
-        <w:t xml:space="preserve">This is the standard solar-position relationship used in astronomical calculations as seen in the </w:t>
-      </w:r>
-      <w:r>
-        <w:t>Solar Position Algorithm developed by Micheal Andreas.</w:t>
-      </w:r>
-      <w:r>
-        <w:rPr>
-          <w:rStyle w:val="FootnoteReference"/>
-        </w:rPr>
-        <w:footnoteReference w:id="1"/>
+        <w:t xml:space="preserve"> begins shortly after the sun reaches its highest point in the sky (zenith/meridian) and starts to decline, casting a slight shadow to the east. Ends when the shadow of an object grows to be equal in length to the object itself (or doubles in length depending on the legal school or Madhab). views (</w:t>
+      </w:r>
+      <w:proofErr w:type="spellStart"/>
+      <w:r>
+        <w:t>hanafi</w:t>
+      </w:r>
+      <w:proofErr w:type="spellEnd"/>
+      <w:r>
+        <w:t xml:space="preserve"> =&gt; double length, Shafi'i =&gt; single length) I want to support both </w:t>
+      </w:r>
+    </w:p>
+    <w:p>
+      <w:r>
+        <w:lastRenderedPageBreak/>
+        <w:t xml:space="preserve">Asr - From the End of </w:t>
+      </w:r>
+      <w:proofErr w:type="spellStart"/>
+      <w:r>
+        <w:t>Dhuhr</w:t>
+      </w:r>
+      <w:proofErr w:type="spellEnd"/>
+      <w:r>
+        <w:t xml:space="preserve"> until just before Sunset (we will leave 5 minutes between the end of Asr and the beginning of Maghrib)</w:t>
+      </w:r>
+    </w:p>
+    <w:p>
+      <w:r>
+        <w:t>Maghrib - Just after sunset until the red twilight (</w:t>
+      </w:r>
+      <w:proofErr w:type="spellStart"/>
+      <w:r>
+        <w:t>shafaq</w:t>
+      </w:r>
+      <w:proofErr w:type="spellEnd"/>
+      <w:r>
+        <w:t>) or afterglow fades from the sky</w:t>
+      </w:r>
+    </w:p>
+    <w:p>
+      <w:r>
+        <w:t>Isha - When the red twilight (</w:t>
+      </w:r>
+      <w:proofErr w:type="spellStart"/>
+      <w:r>
+        <w:t>shafaq</w:t>
+      </w:r>
+      <w:proofErr w:type="spellEnd"/>
+      <w:r>
+        <w:t>) or afterglow fades from the sky. Extends until the beginning of Fajr time</w:t>
       </w:r>
     </w:p>
     <w:sectPr>
@@ -605,49 +650,342 @@
       </w:r>
     </w:p>
   </w:footnote>
-  <w:footnote w:id="1">
-    <w:p>
-      <w:pPr>
-        <w:pStyle w:val="FootnoteText"/>
-      </w:pPr>
-      <w:r>
-        <w:rPr>
-          <w:rStyle w:val="FootnoteReference"/>
-        </w:rPr>
-        <w:footnoteRef/>
-      </w:r>
-      <w:r>
-        <w:t xml:space="preserve"> </w:t>
-      </w:r>
-      <w:sdt>
-        <w:sdtPr>
-          <w:id w:val="-1919710071"/>
-          <w:citation/>
-        </w:sdtPr>
-        <w:sdtContent>
-          <w:r>
-            <w:fldChar w:fldCharType="begin"/>
-          </w:r>
-          <w:r>
-            <w:instrText xml:space="preserve"> CITATION Red08 \l 4105 </w:instrText>
-          </w:r>
-          <w:r>
-            <w:fldChar w:fldCharType="separate"/>
-          </w:r>
-          <w:r>
-            <w:rPr>
-              <w:noProof/>
-            </w:rPr>
-            <w:t>(Reda and Andreas 2008)</w:t>
-          </w:r>
-          <w:r>
-            <w:fldChar w:fldCharType="end"/>
-          </w:r>
-        </w:sdtContent>
-      </w:sdt>
-    </w:p>
-  </w:footnote>
 </w:footnotes>
+</file>
+
+<file path=word/numbering.xml><?xml version="1.0" encoding="utf-8"?>
+<w:numbering xmlns:wpc="http://schemas.microsoft.com/office/word/2010/wordprocessingCanvas" xmlns:cx="http://schemas.microsoft.com/office/drawing/2014/chartex" xmlns:cx1="http://schemas.microsoft.com/office/drawing/2015/9/8/chartex" xmlns:cx2="http://schemas.microsoft.com/office/drawing/2015/10/21/chartex" xmlns:cx3="http://schemas.microsoft.com/office/drawing/2016/5/9/chartex" xmlns:cx4="http://schemas.microsoft.com/office/drawing/2016/5/10/chartex" xmlns:cx5="http://schemas.microsoft.com/office/drawing/2016/5/11/chartex" xmlns:cx6="http://schemas.microsoft.com/office/drawing/2016/5/12/chartex" xmlns:cx7="http://schemas.microsoft.com/office/drawing/2016/5/13/chartex" xmlns:cx8="http://schemas.microsoft.com/office/drawing/2016/5/14/chartex" xmlns:mc="http://schemas.openxmlformats.org/markup-compatibility/2006" xmlns:m="http://schemas.openxmlformats.org/officeDocument/2006/math" xmlns:aink="http://schemas.microsoft.com/office/drawing/2016/ink" xmlns:am3d="http://schemas.microsoft.com/office/drawing/2017/model3d" xmlns:oel="http://schemas.microsoft.com/office/2019/extlst" xmlns:r="http://schemas.openxmlformats.org/officeDocument/2006/relationships" xmlns:wp14="http://schemas.microsoft.com/office/word/2010/wordprocessingDrawing" xmlns:wp="http://schemas.openxmlformats.org/drawingml/2006/wordprocessingDrawing" xmlns:wpg="http://schemas.microsoft.com/office/word/2010/wordprocessingGroup" xmlns:wpi="http://schemas.microsoft.com/office/word/2010/wordprocessingInk" xmlns:wps="http://schemas.microsoft.com/office/word/2010/wordprocessingShape" xmlns:o="urn:schemas-microsoft-com:office:office" xmlns:v="urn:schemas-microsoft-com:vml" xmlns:w10="urn:schemas-microsoft-com:office:word" xmlns:w="http://schemas.openxmlformats.org/wordprocessingml/2006/main" xmlns:w14="http://schemas.microsoft.com/office/word/2010/wordml" xmlns:w15="http://schemas.microsoft.com/office/word/2012/wordml" xmlns:w16cex="http://schemas.microsoft.com/office/word/2018/wordml/cex" xmlns:w16cid="http://schemas.microsoft.com/office/word/2016/wordml/cid" xmlns:w16="http://schemas.microsoft.com/office/word/2018/wordml" xmlns:w16sdtdh="http://schemas.microsoft.com/office/word/2020/wordml/sdtdatahash" xmlns:w16sdtfl="http://schemas.microsoft.com/office/word/2024/wordml/sdtformatlock" xmlns:w16se="http://schemas.microsoft.com/office/word/2015/wordml/symex" xmlns:w16du="http://schemas.microsoft.com/office/word/2023/wordml/word16du" xmlns:wne="http://schemas.microsoft.com/office/word/2006/wordml" mc:Ignorable="w14 w15 w16se w16cid w16 w16cex w16sdtdh w16sdtfl w16du wp14">
+  <w:abstractNum w:abstractNumId="0" w15:restartNumberingAfterBreak="0">
+    <w:nsid w:val="34C072E6"/>
+    <w:multiLevelType w:val="hybridMultilevel"/>
+    <w:tmpl w:val="5A5CCE60"/>
+    <w:lvl w:ilvl="0" w:tplc="04CC43B2">
+      <w:start w:val="26"/>
+      <w:numFmt w:val="bullet"/>
+      <w:lvlText w:val="-"/>
+      <w:lvlJc w:val="left"/>
+      <w:pPr>
+        <w:ind w:left="720" w:hanging="360"/>
+      </w:pPr>
+      <w:rPr>
+        <w:rFonts w:ascii="Aptos" w:eastAsiaTheme="minorHAnsi" w:hAnsi="Aptos" w:cstheme="minorBidi" w:hint="default"/>
+      </w:rPr>
+    </w:lvl>
+    <w:lvl w:ilvl="1" w:tplc="04090003">
+      <w:start w:val="1"/>
+      <w:numFmt w:val="bullet"/>
+      <w:lvlText w:val="o"/>
+      <w:lvlJc w:val="left"/>
+      <w:pPr>
+        <w:ind w:left="1440" w:hanging="360"/>
+      </w:pPr>
+      <w:rPr>
+        <w:rFonts w:ascii="Courier New" w:hAnsi="Courier New" w:cs="Courier New" w:hint="default"/>
+      </w:rPr>
+    </w:lvl>
+    <w:lvl w:ilvl="2" w:tplc="04090005">
+      <w:start w:val="1"/>
+      <w:numFmt w:val="bullet"/>
+      <w:lvlText w:val=""/>
+      <w:lvlJc w:val="left"/>
+      <w:pPr>
+        <w:ind w:left="2160" w:hanging="360"/>
+      </w:pPr>
+      <w:rPr>
+        <w:rFonts w:ascii="Wingdings" w:hAnsi="Wingdings" w:hint="default"/>
+      </w:rPr>
+    </w:lvl>
+    <w:lvl w:ilvl="3" w:tplc="04090001" w:tentative="1">
+      <w:start w:val="1"/>
+      <w:numFmt w:val="bullet"/>
+      <w:lvlText w:val=""/>
+      <w:lvlJc w:val="left"/>
+      <w:pPr>
+        <w:ind w:left="2880" w:hanging="360"/>
+      </w:pPr>
+      <w:rPr>
+        <w:rFonts w:ascii="Symbol" w:hAnsi="Symbol" w:hint="default"/>
+      </w:rPr>
+    </w:lvl>
+    <w:lvl w:ilvl="4" w:tplc="04090003" w:tentative="1">
+      <w:start w:val="1"/>
+      <w:numFmt w:val="bullet"/>
+      <w:lvlText w:val="o"/>
+      <w:lvlJc w:val="left"/>
+      <w:pPr>
+        <w:ind w:left="3600" w:hanging="360"/>
+      </w:pPr>
+      <w:rPr>
+        <w:rFonts w:ascii="Courier New" w:hAnsi="Courier New" w:cs="Courier New" w:hint="default"/>
+      </w:rPr>
+    </w:lvl>
+    <w:lvl w:ilvl="5" w:tplc="04090005" w:tentative="1">
+      <w:start w:val="1"/>
+      <w:numFmt w:val="bullet"/>
+      <w:lvlText w:val=""/>
+      <w:lvlJc w:val="left"/>
+      <w:pPr>
+        <w:ind w:left="4320" w:hanging="360"/>
+      </w:pPr>
+      <w:rPr>
+        <w:rFonts w:ascii="Wingdings" w:hAnsi="Wingdings" w:hint="default"/>
+      </w:rPr>
+    </w:lvl>
+    <w:lvl w:ilvl="6" w:tplc="04090001" w:tentative="1">
+      <w:start w:val="1"/>
+      <w:numFmt w:val="bullet"/>
+      <w:lvlText w:val=""/>
+      <w:lvlJc w:val="left"/>
+      <w:pPr>
+        <w:ind w:left="5040" w:hanging="360"/>
+      </w:pPr>
+      <w:rPr>
+        <w:rFonts w:ascii="Symbol" w:hAnsi="Symbol" w:hint="default"/>
+      </w:rPr>
+    </w:lvl>
+    <w:lvl w:ilvl="7" w:tplc="04090003" w:tentative="1">
+      <w:start w:val="1"/>
+      <w:numFmt w:val="bullet"/>
+      <w:lvlText w:val="o"/>
+      <w:lvlJc w:val="left"/>
+      <w:pPr>
+        <w:ind w:left="5760" w:hanging="360"/>
+      </w:pPr>
+      <w:rPr>
+        <w:rFonts w:ascii="Courier New" w:hAnsi="Courier New" w:cs="Courier New" w:hint="default"/>
+      </w:rPr>
+    </w:lvl>
+    <w:lvl w:ilvl="8" w:tplc="04090005" w:tentative="1">
+      <w:start w:val="1"/>
+      <w:numFmt w:val="bullet"/>
+      <w:lvlText w:val=""/>
+      <w:lvlJc w:val="left"/>
+      <w:pPr>
+        <w:ind w:left="6480" w:hanging="360"/>
+      </w:pPr>
+      <w:rPr>
+        <w:rFonts w:ascii="Wingdings" w:hAnsi="Wingdings" w:hint="default"/>
+      </w:rPr>
+    </w:lvl>
+  </w:abstractNum>
+  <w:abstractNum w:abstractNumId="1" w15:restartNumberingAfterBreak="0">
+    <w:nsid w:val="39E263F6"/>
+    <w:multiLevelType w:val="multilevel"/>
+    <w:tmpl w:val="04090025"/>
+    <w:lvl w:ilvl="0">
+      <w:start w:val="1"/>
+      <w:numFmt w:val="decimal"/>
+      <w:pStyle w:val="Heading1"/>
+      <w:lvlText w:val="%1"/>
+      <w:lvlJc w:val="left"/>
+      <w:pPr>
+        <w:ind w:left="432" w:hanging="432"/>
+      </w:pPr>
+    </w:lvl>
+    <w:lvl w:ilvl="1">
+      <w:start w:val="1"/>
+      <w:numFmt w:val="decimal"/>
+      <w:pStyle w:val="Heading2"/>
+      <w:lvlText w:val="%1.%2"/>
+      <w:lvlJc w:val="left"/>
+      <w:pPr>
+        <w:ind w:left="576" w:hanging="576"/>
+      </w:pPr>
+    </w:lvl>
+    <w:lvl w:ilvl="2">
+      <w:start w:val="1"/>
+      <w:numFmt w:val="decimal"/>
+      <w:pStyle w:val="Heading3"/>
+      <w:lvlText w:val="%1.%2.%3"/>
+      <w:lvlJc w:val="left"/>
+      <w:pPr>
+        <w:ind w:left="720" w:hanging="720"/>
+      </w:pPr>
+    </w:lvl>
+    <w:lvl w:ilvl="3">
+      <w:start w:val="1"/>
+      <w:numFmt w:val="decimal"/>
+      <w:pStyle w:val="Heading4"/>
+      <w:lvlText w:val="%1.%2.%3.%4"/>
+      <w:lvlJc w:val="left"/>
+      <w:pPr>
+        <w:ind w:left="864" w:hanging="864"/>
+      </w:pPr>
+    </w:lvl>
+    <w:lvl w:ilvl="4">
+      <w:start w:val="1"/>
+      <w:numFmt w:val="decimal"/>
+      <w:pStyle w:val="Heading5"/>
+      <w:lvlText w:val="%1.%2.%3.%4.%5"/>
+      <w:lvlJc w:val="left"/>
+      <w:pPr>
+        <w:ind w:left="1008" w:hanging="1008"/>
+      </w:pPr>
+    </w:lvl>
+    <w:lvl w:ilvl="5">
+      <w:start w:val="1"/>
+      <w:numFmt w:val="decimal"/>
+      <w:pStyle w:val="Heading6"/>
+      <w:lvlText w:val="%1.%2.%3.%4.%5.%6"/>
+      <w:lvlJc w:val="left"/>
+      <w:pPr>
+        <w:ind w:left="1152" w:hanging="1152"/>
+      </w:pPr>
+    </w:lvl>
+    <w:lvl w:ilvl="6">
+      <w:start w:val="1"/>
+      <w:numFmt w:val="decimal"/>
+      <w:pStyle w:val="Heading7"/>
+      <w:lvlText w:val="%1.%2.%3.%4.%5.%6.%7"/>
+      <w:lvlJc w:val="left"/>
+      <w:pPr>
+        <w:ind w:left="1296" w:hanging="1296"/>
+      </w:pPr>
+    </w:lvl>
+    <w:lvl w:ilvl="7">
+      <w:start w:val="1"/>
+      <w:numFmt w:val="decimal"/>
+      <w:pStyle w:val="Heading8"/>
+      <w:lvlText w:val="%1.%2.%3.%4.%5.%6.%7.%8"/>
+      <w:lvlJc w:val="left"/>
+      <w:pPr>
+        <w:ind w:left="1440" w:hanging="1440"/>
+      </w:pPr>
+    </w:lvl>
+    <w:lvl w:ilvl="8">
+      <w:start w:val="1"/>
+      <w:numFmt w:val="decimal"/>
+      <w:pStyle w:val="Heading9"/>
+      <w:lvlText w:val="%1.%2.%3.%4.%5.%6.%7.%8.%9"/>
+      <w:lvlJc w:val="left"/>
+      <w:pPr>
+        <w:ind w:left="1584" w:hanging="1584"/>
+      </w:pPr>
+    </w:lvl>
+  </w:abstractNum>
+  <w:abstractNum w:abstractNumId="2" w15:restartNumberingAfterBreak="0">
+    <w:nsid w:val="4B95482E"/>
+    <w:multiLevelType w:val="hybridMultilevel"/>
+    <w:tmpl w:val="2086230E"/>
+    <w:lvl w:ilvl="0" w:tplc="ADAC16B2">
+      <w:start w:val="26"/>
+      <w:numFmt w:val="bullet"/>
+      <w:lvlText w:val=""/>
+      <w:lvlJc w:val="left"/>
+      <w:pPr>
+        <w:ind w:left="720" w:hanging="360"/>
+      </w:pPr>
+      <w:rPr>
+        <w:rFonts w:ascii="Wingdings" w:eastAsiaTheme="minorHAnsi" w:hAnsi="Wingdings" w:cstheme="minorBidi" w:hint="default"/>
+      </w:rPr>
+    </w:lvl>
+    <w:lvl w:ilvl="1" w:tplc="04090003" w:tentative="1">
+      <w:start w:val="1"/>
+      <w:numFmt w:val="bullet"/>
+      <w:lvlText w:val="o"/>
+      <w:lvlJc w:val="left"/>
+      <w:pPr>
+        <w:ind w:left="1440" w:hanging="360"/>
+      </w:pPr>
+      <w:rPr>
+        <w:rFonts w:ascii="Courier New" w:hAnsi="Courier New" w:cs="Courier New" w:hint="default"/>
+      </w:rPr>
+    </w:lvl>
+    <w:lvl w:ilvl="2" w:tplc="04090005" w:tentative="1">
+      <w:start w:val="1"/>
+      <w:numFmt w:val="bullet"/>
+      <w:lvlText w:val=""/>
+      <w:lvlJc w:val="left"/>
+      <w:pPr>
+        <w:ind w:left="2160" w:hanging="360"/>
+      </w:pPr>
+      <w:rPr>
+        <w:rFonts w:ascii="Wingdings" w:hAnsi="Wingdings" w:hint="default"/>
+      </w:rPr>
+    </w:lvl>
+    <w:lvl w:ilvl="3" w:tplc="04090001" w:tentative="1">
+      <w:start w:val="1"/>
+      <w:numFmt w:val="bullet"/>
+      <w:lvlText w:val=""/>
+      <w:lvlJc w:val="left"/>
+      <w:pPr>
+        <w:ind w:left="2880" w:hanging="360"/>
+      </w:pPr>
+      <w:rPr>
+        <w:rFonts w:ascii="Symbol" w:hAnsi="Symbol" w:hint="default"/>
+      </w:rPr>
+    </w:lvl>
+    <w:lvl w:ilvl="4" w:tplc="04090003" w:tentative="1">
+      <w:start w:val="1"/>
+      <w:numFmt w:val="bullet"/>
+      <w:lvlText w:val="o"/>
+      <w:lvlJc w:val="left"/>
+      <w:pPr>
+        <w:ind w:left="3600" w:hanging="360"/>
+      </w:pPr>
+      <w:rPr>
+        <w:rFonts w:ascii="Courier New" w:hAnsi="Courier New" w:cs="Courier New" w:hint="default"/>
+      </w:rPr>
+    </w:lvl>
+    <w:lvl w:ilvl="5" w:tplc="04090005" w:tentative="1">
+      <w:start w:val="1"/>
+      <w:numFmt w:val="bullet"/>
+      <w:lvlText w:val=""/>
+      <w:lvlJc w:val="left"/>
+      <w:pPr>
+        <w:ind w:left="4320" w:hanging="360"/>
+      </w:pPr>
+      <w:rPr>
+        <w:rFonts w:ascii="Wingdings" w:hAnsi="Wingdings" w:hint="default"/>
+      </w:rPr>
+    </w:lvl>
+    <w:lvl w:ilvl="6" w:tplc="04090001" w:tentative="1">
+      <w:start w:val="1"/>
+      <w:numFmt w:val="bullet"/>
+      <w:lvlText w:val=""/>
+      <w:lvlJc w:val="left"/>
+      <w:pPr>
+        <w:ind w:left="5040" w:hanging="360"/>
+      </w:pPr>
+      <w:rPr>
+        <w:rFonts w:ascii="Symbol" w:hAnsi="Symbol" w:hint="default"/>
+      </w:rPr>
+    </w:lvl>
+    <w:lvl w:ilvl="7" w:tplc="04090003" w:tentative="1">
+      <w:start w:val="1"/>
+      <w:numFmt w:val="bullet"/>
+      <w:lvlText w:val="o"/>
+      <w:lvlJc w:val="left"/>
+      <w:pPr>
+        <w:ind w:left="5760" w:hanging="360"/>
+      </w:pPr>
+      <w:rPr>
+        <w:rFonts w:ascii="Courier New" w:hAnsi="Courier New" w:cs="Courier New" w:hint="default"/>
+      </w:rPr>
+    </w:lvl>
+    <w:lvl w:ilvl="8" w:tplc="04090005" w:tentative="1">
+      <w:start w:val="1"/>
+      <w:numFmt w:val="bullet"/>
+      <w:lvlText w:val=""/>
+      <w:lvlJc w:val="left"/>
+      <w:pPr>
+        <w:ind w:left="6480" w:hanging="360"/>
+      </w:pPr>
+      <w:rPr>
+        <w:rFonts w:ascii="Wingdings" w:hAnsi="Wingdings" w:hint="default"/>
+      </w:rPr>
+    </w:lvl>
+  </w:abstractNum>
+  <w:num w:numId="1" w16cid:durableId="1431198206">
+    <w:abstractNumId w:val="1"/>
+  </w:num>
+  <w:num w:numId="2" w16cid:durableId="177044920">
+    <w:abstractNumId w:val="2"/>
+  </w:num>
+  <w:num w:numId="3" w16cid:durableId="979846762">
+    <w:abstractNumId w:val="0"/>
+  </w:num>
+</w:numbering>
 </file>
 
 <file path=word/styles.xml><?xml version="1.0" encoding="utf-8"?>
@@ -1062,6 +1400,9 @@
     <w:pPr>
       <w:keepNext/>
       <w:keepLines/>
+      <w:numPr>
+        <w:numId w:val="1"/>
+      </w:numPr>
       <w:spacing w:before="360" w:after="80"/>
       <w:outlineLvl w:val="0"/>
     </w:pPr>
@@ -1078,13 +1419,16 @@
     <w:next w:val="Normal"/>
     <w:link w:val="Heading2Char"/>
     <w:uiPriority w:val="9"/>
-    <w:semiHidden/>
     <w:unhideWhenUsed/>
     <w:qFormat/>
     <w:rsid w:val="003908BC"/>
     <w:pPr>
       <w:keepNext/>
       <w:keepLines/>
+      <w:numPr>
+        <w:ilvl w:val="1"/>
+        <w:numId w:val="1"/>
+      </w:numPr>
       <w:spacing w:before="160" w:after="80"/>
       <w:outlineLvl w:val="1"/>
     </w:pPr>
@@ -1101,13 +1445,16 @@
     <w:next w:val="Normal"/>
     <w:link w:val="Heading3Char"/>
     <w:uiPriority w:val="9"/>
-    <w:semiHidden/>
     <w:unhideWhenUsed/>
     <w:qFormat/>
     <w:rsid w:val="003908BC"/>
     <w:pPr>
       <w:keepNext/>
       <w:keepLines/>
+      <w:numPr>
+        <w:ilvl w:val="2"/>
+        <w:numId w:val="1"/>
+      </w:numPr>
       <w:spacing w:before="160" w:after="80"/>
       <w:outlineLvl w:val="2"/>
     </w:pPr>
@@ -1131,6 +1478,10 @@
     <w:pPr>
       <w:keepNext/>
       <w:keepLines/>
+      <w:numPr>
+        <w:ilvl w:val="3"/>
+        <w:numId w:val="1"/>
+      </w:numPr>
       <w:spacing w:before="80" w:after="40"/>
       <w:outlineLvl w:val="3"/>
     </w:pPr>
@@ -1154,6 +1505,10 @@
     <w:pPr>
       <w:keepNext/>
       <w:keepLines/>
+      <w:numPr>
+        <w:ilvl w:val="4"/>
+        <w:numId w:val="1"/>
+      </w:numPr>
       <w:spacing w:before="80" w:after="40"/>
       <w:outlineLvl w:val="4"/>
     </w:pPr>
@@ -1175,6 +1530,10 @@
     <w:pPr>
       <w:keepNext/>
       <w:keepLines/>
+      <w:numPr>
+        <w:ilvl w:val="5"/>
+        <w:numId w:val="1"/>
+      </w:numPr>
       <w:spacing w:before="40" w:after="0"/>
       <w:outlineLvl w:val="5"/>
     </w:pPr>
@@ -1198,6 +1557,10 @@
     <w:pPr>
       <w:keepNext/>
       <w:keepLines/>
+      <w:numPr>
+        <w:ilvl w:val="6"/>
+        <w:numId w:val="1"/>
+      </w:numPr>
       <w:spacing w:before="40" w:after="0"/>
       <w:outlineLvl w:val="6"/>
     </w:pPr>
@@ -1219,6 +1582,10 @@
     <w:pPr>
       <w:keepNext/>
       <w:keepLines/>
+      <w:numPr>
+        <w:ilvl w:val="7"/>
+        <w:numId w:val="1"/>
+      </w:numPr>
       <w:spacing w:after="0"/>
       <w:outlineLvl w:val="7"/>
     </w:pPr>
@@ -1242,6 +1609,10 @@
     <w:pPr>
       <w:keepNext/>
       <w:keepLines/>
+      <w:numPr>
+        <w:ilvl w:val="8"/>
+        <w:numId w:val="1"/>
+      </w:numPr>
       <w:spacing w:after="0"/>
       <w:outlineLvl w:val="8"/>
     </w:pPr>
@@ -1295,7 +1666,6 @@
     <w:basedOn w:val="DefaultParagraphFont"/>
     <w:link w:val="Heading2"/>
     <w:uiPriority w:val="9"/>
-    <w:semiHidden/>
     <w:rsid w:val="003908BC"/>
     <w:rPr>
       <w:rFonts w:asciiTheme="majorHAnsi" w:eastAsiaTheme="majorEastAsia" w:hAnsiTheme="majorHAnsi" w:cstheme="majorBidi"/>
@@ -1309,7 +1679,6 @@
     <w:basedOn w:val="DefaultParagraphFont"/>
     <w:link w:val="Heading3"/>
     <w:uiPriority w:val="9"/>
-    <w:semiHidden/>
     <w:rsid w:val="003908BC"/>
     <w:rPr>
       <w:rFonts w:eastAsiaTheme="majorEastAsia" w:cstheme="majorBidi"/>
@@ -1964,7 +2333,7 @@
 </file>
 
 <file path=customXml/itemProps1.xml><?xml version="1.0" encoding="utf-8"?>
-<ds:datastoreItem xmlns:ds="http://schemas.openxmlformats.org/officeDocument/2006/customXml" ds:itemID="{0864DD8A-4D8C-FF4B-8C8E-5E43D31C2B23}">
+<ds:datastoreItem xmlns:ds="http://schemas.openxmlformats.org/officeDocument/2006/customXml" ds:itemID="{871C3BD5-5DAB-3A4B-ADC1-BAD9DE937C24}">
   <ds:schemaRefs>
     <ds:schemaRef ds:uri="http://schemas.openxmlformats.org/officeDocument/2006/bibliography"/>
   </ds:schemaRefs>

</xml_diff>

<commit_message>
research: added latitude and longitude definitions
</commit_message>
<xml_diff>
--- a/docs/A Mathematical Model for Determining the Five Daily Islamic Prayer Times.docx
+++ b/docs/A Mathematical Model for Determining the Five Daily Islamic Prayer Times.docx
@@ -431,6 +431,18 @@
       </w:r>
       <w:r>
         <w:t>≈ 6,356,752.314 m</w:t>
+      </w:r>
+    </w:p>
+    <w:p>
+      <w:pPr>
+        <w:pStyle w:val="ListParagraph"/>
+        <w:numPr>
+          <w:ilvl w:val="1"/>
+          <w:numId w:val="3"/>
+        </w:numPr>
+      </w:pPr>
+      <w:r>
+        <w:t>Figures provided by the WGS 84 standard (citation here</w:t>
       </w:r>
     </w:p>
     <w:p>
@@ -512,13 +524,1007 @@
         <w:t>Latitude and Longitude</w:t>
       </w:r>
     </w:p>
+    <w:p>
+      <w:pPr>
+        <w:pStyle w:val="ListParagraph"/>
+        <w:numPr>
+          <w:ilvl w:val="0"/>
+          <w:numId w:val="3"/>
+        </w:numPr>
+      </w:pPr>
+      <w:r>
+        <w:t>The geographic position of an observer can be expressed in many ways. Our convention is as follows:</w:t>
+      </w:r>
+    </w:p>
+    <w:p>
+      <w:pPr>
+        <w:pStyle w:val="ListParagraph"/>
+        <w:numPr>
+          <w:ilvl w:val="0"/>
+          <w:numId w:val="3"/>
+        </w:numPr>
+      </w:pPr>
+      <w:r>
+        <w:t>P = (phi, lambda)</w:t>
+      </w:r>
+    </w:p>
+    <w:p>
+      <w:pPr>
+        <w:pStyle w:val="ListParagraph"/>
+        <w:numPr>
+          <w:ilvl w:val="1"/>
+          <w:numId w:val="3"/>
+        </w:numPr>
+      </w:pPr>
+      <w:r>
+        <w:t>-90 &lt;= phi &lt;= 90</w:t>
+      </w:r>
+    </w:p>
+    <w:p>
+      <w:pPr>
+        <w:pStyle w:val="ListParagraph"/>
+        <w:numPr>
+          <w:ilvl w:val="1"/>
+          <w:numId w:val="3"/>
+        </w:numPr>
+      </w:pPr>
+      <w:r>
+        <w:t>-180 &lt;= lambda &lt;= 180</w:t>
+      </w:r>
+    </w:p>
+    <w:p>
+      <w:pPr>
+        <w:pStyle w:val="ListParagraph"/>
+        <w:numPr>
+          <w:ilvl w:val="1"/>
+          <w:numId w:val="3"/>
+        </w:numPr>
+      </w:pPr>
+      <w:r>
+        <w:t>In degrees</w:t>
+      </w:r>
+    </w:p>
+    <w:p>
+      <w:pPr>
+        <w:pStyle w:val="ListParagraph"/>
+        <w:numPr>
+          <w:ilvl w:val="0"/>
+          <w:numId w:val="3"/>
+        </w:numPr>
+      </w:pPr>
+      <w:r>
+        <w:t>Where:</w:t>
+      </w:r>
+    </w:p>
+    <w:p>
+      <w:pPr>
+        <w:pStyle w:val="ListParagraph"/>
+        <w:numPr>
+          <w:ilvl w:val="1"/>
+          <w:numId w:val="3"/>
+        </w:numPr>
+      </w:pPr>
+      <w:r>
+        <w:t xml:space="preserve"> phi = geographic latitude (North +</w:t>
+      </w:r>
+      <w:proofErr w:type="spellStart"/>
+      <w:r>
+        <w:t>ve</w:t>
+      </w:r>
+      <w:proofErr w:type="spellEnd"/>
+      <w:r>
+        <w:t>, south -</w:t>
+      </w:r>
+      <w:proofErr w:type="spellStart"/>
+      <w:r>
+        <w:t>ve</w:t>
+      </w:r>
+      <w:proofErr w:type="spellEnd"/>
+      <w:r>
+        <w:t>)</w:t>
+      </w:r>
+    </w:p>
+    <w:p>
+      <w:pPr>
+        <w:pStyle w:val="ListParagraph"/>
+        <w:numPr>
+          <w:ilvl w:val="1"/>
+          <w:numId w:val="3"/>
+        </w:numPr>
+      </w:pPr>
+      <w:r>
+        <w:t>Lambda = geographic longitude (East +</w:t>
+      </w:r>
+      <w:proofErr w:type="spellStart"/>
+      <w:r>
+        <w:t>ve</w:t>
+      </w:r>
+      <w:proofErr w:type="spellEnd"/>
+      <w:r>
+        <w:t>, west -</w:t>
+      </w:r>
+      <w:proofErr w:type="spellStart"/>
+      <w:r>
+        <w:t>ve</w:t>
+      </w:r>
+      <w:proofErr w:type="spellEnd"/>
+      <w:r>
+        <w:t>)</w:t>
+      </w:r>
+    </w:p>
+    <w:p>
+      <w:pPr>
+        <w:pStyle w:val="ListParagraph"/>
+        <w:numPr>
+          <w:ilvl w:val="0"/>
+          <w:numId w:val="3"/>
+        </w:numPr>
+      </w:pPr>
+      <w:proofErr w:type="spellStart"/>
+      <w:r>
+        <w:t>Lattitude</w:t>
+      </w:r>
+      <w:proofErr w:type="spellEnd"/>
+      <w:r>
+        <w:t xml:space="preserve"> (phi) </w:t>
+      </w:r>
+    </w:p>
+    <w:p>
+      <w:pPr>
+        <w:pStyle w:val="ListParagraph"/>
+        <w:numPr>
+          <w:ilvl w:val="1"/>
+          <w:numId w:val="3"/>
+        </w:numPr>
+      </w:pPr>
+      <w:r>
+        <w:t>Specifies a location’s north-south position relative to the equator</w:t>
+      </w:r>
+    </w:p>
+    <w:p>
+      <w:pPr>
+        <w:pStyle w:val="ListParagraph"/>
+        <w:numPr>
+          <w:ilvl w:val="1"/>
+          <w:numId w:val="3"/>
+        </w:numPr>
+      </w:pPr>
+      <w:r>
+        <w:t>Note that if the earth were spherical, this would simply be the angle between the equatorial plane and line connecting the observer to the Earth’s center</w:t>
+      </w:r>
+    </w:p>
+    <w:p>
+      <w:pPr>
+        <w:pStyle w:val="ListParagraph"/>
+        <w:numPr>
+          <w:ilvl w:val="1"/>
+          <w:numId w:val="3"/>
+        </w:numPr>
+      </w:pPr>
+      <w:r>
+        <w:t>At the equator phi = 0, at the north pole phi = 90</w:t>
+      </w:r>
+    </w:p>
+    <w:p>
+      <w:pPr>
+        <w:pStyle w:val="ListParagraph"/>
+        <w:numPr>
+          <w:ilvl w:val="1"/>
+          <w:numId w:val="3"/>
+        </w:numPr>
+      </w:pPr>
+      <w:r>
+        <w:lastRenderedPageBreak/>
+        <w:t>This definition requires some adjustment due to our ellipsoidal Earth</w:t>
+      </w:r>
+    </w:p>
+    <w:p>
+      <w:pPr>
+        <w:pStyle w:val="ListParagraph"/>
+        <w:numPr>
+          <w:ilvl w:val="1"/>
+          <w:numId w:val="3"/>
+        </w:numPr>
+      </w:pPr>
+      <w:r>
+        <w:t>[insert diagram for latitude]</w:t>
+      </w:r>
+    </w:p>
+    <w:p>
+      <w:pPr>
+        <w:pStyle w:val="ListParagraph"/>
+        <w:numPr>
+          <w:ilvl w:val="0"/>
+          <w:numId w:val="3"/>
+        </w:numPr>
+      </w:pPr>
+      <w:r>
+        <w:t>Longitude (lambda)</w:t>
+      </w:r>
+    </w:p>
+    <w:p>
+      <w:pPr>
+        <w:pStyle w:val="ListParagraph"/>
+        <w:numPr>
+          <w:ilvl w:val="1"/>
+          <w:numId w:val="3"/>
+        </w:numPr>
+      </w:pPr>
+      <w:proofErr w:type="spellStart"/>
+      <w:r>
+        <w:t>Speficies</w:t>
+      </w:r>
+      <w:proofErr w:type="spellEnd"/>
+      <w:r>
+        <w:t xml:space="preserve"> the east-west angular position of a location relative to a reference meridian</w:t>
+      </w:r>
+    </w:p>
+    <w:p>
+      <w:pPr>
+        <w:pStyle w:val="ListParagraph"/>
+        <w:numPr>
+          <w:ilvl w:val="1"/>
+          <w:numId w:val="3"/>
+        </w:numPr>
+      </w:pPr>
+      <w:r>
+        <w:t>The standard reference meridian is the Greenwich prime meridian, assigned a longitude of 0</w:t>
+      </w:r>
+    </w:p>
+    <w:p>
+      <w:pPr>
+        <w:pStyle w:val="ListParagraph"/>
+        <w:numPr>
+          <w:ilvl w:val="1"/>
+          <w:numId w:val="3"/>
+        </w:numPr>
+      </w:pPr>
+      <w:r>
+        <w:t>Each meridian is a plane passing through the Earth’s rotational axis</w:t>
+      </w:r>
+    </w:p>
+    <w:p>
+      <w:pPr>
+        <w:pStyle w:val="ListParagraph"/>
+        <w:numPr>
+          <w:ilvl w:val="1"/>
+          <w:numId w:val="3"/>
+        </w:numPr>
+      </w:pPr>
+      <w:r>
+        <w:t xml:space="preserve">Longitude is not an angle </w:t>
+      </w:r>
+      <w:proofErr w:type="spellStart"/>
+      <w:r>
+        <w:t>measurd</w:t>
+      </w:r>
+      <w:proofErr w:type="spellEnd"/>
+      <w:r>
+        <w:t xml:space="preserve"> along Earth’s curved surface</w:t>
+      </w:r>
+    </w:p>
+    <w:p>
+      <w:pPr>
+        <w:pStyle w:val="ListParagraph"/>
+        <w:numPr>
+          <w:ilvl w:val="2"/>
+          <w:numId w:val="3"/>
+        </w:numPr>
+      </w:pPr>
+      <w:r>
+        <w:t>It is an angular separation between meridian planes</w:t>
+      </w:r>
+      <w:r>
+        <w:t xml:space="preserve"> (cite </w:t>
+      </w:r>
+      <w:proofErr w:type="spellStart"/>
+      <w:r>
+        <w:t>reda</w:t>
+      </w:r>
+      <w:proofErr w:type="spellEnd"/>
+      <w:r>
+        <w:t xml:space="preserve"> &amp; </w:t>
+      </w:r>
+      <w:proofErr w:type="spellStart"/>
+      <w:r>
+        <w:t>andreas</w:t>
+      </w:r>
+      <w:proofErr w:type="spellEnd"/>
+      <w:r>
+        <w:t xml:space="preserve"> here)</w:t>
+      </w:r>
+    </w:p>
+    <w:p>
+      <w:pPr>
+        <w:pStyle w:val="ListParagraph"/>
+        <w:numPr>
+          <w:ilvl w:val="1"/>
+          <w:numId w:val="3"/>
+        </w:numPr>
+      </w:pPr>
+      <w:r>
+        <w:t>[insert</w:t>
+      </w:r>
+      <w:r>
+        <w:t xml:space="preserve"> longitude diagram</w:t>
+      </w:r>
+      <w:r>
+        <w:t>]</w:t>
+      </w:r>
+    </w:p>
+    <w:p>
+      <w:pPr>
+        <w:pStyle w:val="ListParagraph"/>
+        <w:numPr>
+          <w:ilvl w:val="0"/>
+          <w:numId w:val="3"/>
+        </w:numPr>
+      </w:pPr>
+      <w:r>
+        <w:t>Why keep longitude if we already know the time?</w:t>
+      </w:r>
+    </w:p>
+    <w:p>
+      <w:pPr>
+        <w:pStyle w:val="ListParagraph"/>
+        <w:numPr>
+          <w:ilvl w:val="1"/>
+          <w:numId w:val="3"/>
+        </w:numPr>
+      </w:pPr>
+      <w:r>
+        <w:t>Geographic longitude affects the observer’s relationship to the sun</w:t>
+      </w:r>
+    </w:p>
+    <w:p>
+      <w:pPr>
+        <w:pStyle w:val="ListParagraph"/>
+        <w:numPr>
+          <w:ilvl w:val="1"/>
+          <w:numId w:val="3"/>
+        </w:numPr>
+      </w:pPr>
+      <w:r>
+        <w:t>Suppose two observers share the same latitude, but are separated by longitude (think Vancouver and PEI)</w:t>
+      </w:r>
+    </w:p>
+    <w:p>
+      <w:pPr>
+        <w:pStyle w:val="ListParagraph"/>
+        <w:numPr>
+          <w:ilvl w:val="2"/>
+          <w:numId w:val="3"/>
+        </w:numPr>
+      </w:pPr>
+      <w:r>
+        <w:t xml:space="preserve">The Sun will have different hour angles relative to the </w:t>
+      </w:r>
+      <w:proofErr w:type="gramStart"/>
+      <w:r>
+        <w:t>observers</w:t>
+      </w:r>
+      <w:proofErr w:type="gramEnd"/>
+      <w:r>
+        <w:t xml:space="preserve"> position</w:t>
+      </w:r>
+    </w:p>
+    <w:p>
+      <w:pPr>
+        <w:pStyle w:val="ListParagraph"/>
+        <w:numPr>
+          <w:ilvl w:val="1"/>
+          <w:numId w:val="3"/>
+        </w:numPr>
+      </w:pPr>
+      <w:r>
+        <w:t>The earth rotates approximately 360 degrees relative to the sun over one solar day. A difference in 15 degrees in longitude generally corresponds to one hour of solar time difference.</w:t>
+      </w:r>
+    </w:p>
+    <w:p>
+      <w:pPr>
+        <w:pStyle w:val="ListParagraph"/>
+        <w:numPr>
+          <w:ilvl w:val="1"/>
+          <w:numId w:val="3"/>
+        </w:numPr>
+      </w:pPr>
+      <w:r>
+        <w:t>[insert diagram that illustrates this difference]</w:t>
+      </w:r>
+    </w:p>
+    <w:p>
+      <w:pPr>
+        <w:pStyle w:val="ListParagraph"/>
+        <w:numPr>
+          <w:ilvl w:val="1"/>
+          <w:numId w:val="3"/>
+        </w:numPr>
+      </w:pPr>
+      <w:r>
+        <w:t xml:space="preserve">Note that the earth’s orbital motion is also not a perfect sphere and is </w:t>
+      </w:r>
+      <w:proofErr w:type="spellStart"/>
+      <w:r>
+        <w:t>infact</w:t>
+      </w:r>
+      <w:proofErr w:type="spellEnd"/>
+      <w:r>
+        <w:t xml:space="preserve"> another ellipsoid. </w:t>
+      </w:r>
+      <w:proofErr w:type="gramStart"/>
+      <w:r>
+        <w:t>Thus</w:t>
+      </w:r>
+      <w:proofErr w:type="gramEnd"/>
+      <w:r>
+        <w:t xml:space="preserve"> the duration of apparent solar days </w:t>
+      </w:r>
+      <w:proofErr w:type="gramStart"/>
+      <w:r>
+        <w:t>varies</w:t>
+      </w:r>
+      <w:proofErr w:type="gramEnd"/>
+      <w:r>
+        <w:t xml:space="preserve"> and the above relationship is not always correct</w:t>
+      </w:r>
+    </w:p>
+    <w:p>
+      <w:pPr>
+        <w:pStyle w:val="ListParagraph"/>
+        <w:numPr>
+          <w:ilvl w:val="1"/>
+          <w:numId w:val="3"/>
+        </w:numPr>
+      </w:pPr>
+      <w:r>
+        <w:t>Key takeaway: longitude connects the Earth’s geographic coordinate system to the local position of the Sun</w:t>
+      </w:r>
+    </w:p>
+    <w:p>
+      <w:pPr>
+        <w:pStyle w:val="Heading3"/>
+      </w:pPr>
+      <w:r>
+        <w:t>Geodetic vs Geocentric Latitude</w:t>
+      </w:r>
+    </w:p>
+    <w:p>
+      <w:pPr>
+        <w:pStyle w:val="ListParagraph"/>
+        <w:numPr>
+          <w:ilvl w:val="0"/>
+          <w:numId w:val="3"/>
+        </w:numPr>
+      </w:pPr>
+      <w:r>
+        <w:t xml:space="preserve">Up to this </w:t>
+      </w:r>
+      <w:proofErr w:type="gramStart"/>
+      <w:r>
+        <w:t>point,  latitude</w:t>
+      </w:r>
+      <w:proofErr w:type="gramEnd"/>
+      <w:r>
+        <w:t xml:space="preserve"> has been something intuitive. However, due to the ellipsoidal nature of the Earth, there are two angles that are confused.</w:t>
+      </w:r>
+    </w:p>
+    <w:p>
+      <w:pPr>
+        <w:pStyle w:val="ListParagraph"/>
+        <w:numPr>
+          <w:ilvl w:val="0"/>
+          <w:numId w:val="3"/>
+        </w:numPr>
+      </w:pPr>
+      <w:r>
+        <w:t>Define</w:t>
+      </w:r>
+    </w:p>
+    <w:p>
+      <w:pPr>
+        <w:pStyle w:val="ListParagraph"/>
+        <w:numPr>
+          <w:ilvl w:val="1"/>
+          <w:numId w:val="3"/>
+        </w:numPr>
+      </w:pPr>
+      <w:r>
+        <w:t>Geodetic system: References an ellipsoid Earth</w:t>
+      </w:r>
+    </w:p>
+    <w:p>
+      <w:pPr>
+        <w:pStyle w:val="ListParagraph"/>
+        <w:numPr>
+          <w:ilvl w:val="1"/>
+          <w:numId w:val="3"/>
+        </w:numPr>
+      </w:pPr>
+      <w:r>
+        <w:t xml:space="preserve">Geocentric system: models the earth as a sphere and measures positions relative to the Earth’s center of mass </w:t>
+      </w:r>
+    </w:p>
+    <w:p>
+      <w:r>
+        <w:lastRenderedPageBreak/>
+        <w:fldChar w:fldCharType="begin"/>
+      </w:r>
+      <w:r>
+        <w:instrText xml:space="preserve"> INCLUDEPICTURE "https://www.fatiando.org/boule/v0.3.0/_images/coordinate.png" \* MERGEFORMATINET </w:instrText>
+      </w:r>
+      <w:r>
+        <w:fldChar w:fldCharType="separate"/>
+      </w:r>
+      <w:r>
+        <w:rPr>
+          <w:noProof/>
+        </w:rPr>
+        <w:drawing>
+          <wp:inline distT="0" distB="0" distL="0" distR="0" wp14:anchorId="75AD8705" wp14:editId="066CEC71">
+            <wp:extent cx="3700130" cy="3753102"/>
+            <wp:effectExtent l="0" t="0" r="0" b="0"/>
+            <wp:docPr id="1064745208" name="Picture 3" descr="Depiction of geocentric and geodetic systems with associated coordinates."/>
+            <wp:cNvGraphicFramePr>
+              <a:graphicFrameLocks xmlns:a="http://schemas.openxmlformats.org/drawingml/2006/main" noChangeAspect="1"/>
+            </wp:cNvGraphicFramePr>
+            <a:graphic xmlns:a="http://schemas.openxmlformats.org/drawingml/2006/main">
+              <a:graphicData uri="http://schemas.openxmlformats.org/drawingml/2006/picture">
+                <pic:pic xmlns:pic="http://schemas.openxmlformats.org/drawingml/2006/picture">
+                  <pic:nvPicPr>
+                    <pic:cNvPr id="0" name="Picture 6" descr="Depiction of geocentric and geodetic systems with associated coordinates."/>
+                    <pic:cNvPicPr>
+                      <a:picLocks noChangeAspect="1" noChangeArrowheads="1"/>
+                    </pic:cNvPicPr>
+                  </pic:nvPicPr>
+                  <pic:blipFill>
+                    <a:blip r:embed="rId10">
+                      <a:extLst>
+                        <a:ext uri="{28A0092B-C50C-407E-A947-70E740481C1C}">
+                          <a14:useLocalDpi xmlns:a14="http://schemas.microsoft.com/office/drawing/2010/main" val="0"/>
+                        </a:ext>
+                      </a:extLst>
+                    </a:blip>
+                    <a:srcRect/>
+                    <a:stretch>
+                      <a:fillRect/>
+                    </a:stretch>
+                  </pic:blipFill>
+                  <pic:spPr bwMode="auto">
+                    <a:xfrm>
+                      <a:off x="0" y="0"/>
+                      <a:ext cx="3720519" cy="3773783"/>
+                    </a:xfrm>
+                    <a:prstGeom prst="rect">
+                      <a:avLst/>
+                    </a:prstGeom>
+                    <a:noFill/>
+                    <a:ln>
+                      <a:noFill/>
+                    </a:ln>
+                  </pic:spPr>
+                </pic:pic>
+              </a:graphicData>
+            </a:graphic>
+          </wp:inline>
+        </w:drawing>
+      </w:r>
+      <w:r>
+        <w:fldChar w:fldCharType="end"/>
+      </w:r>
+      <w:r>
+        <w:t xml:space="preserve"> </w:t>
+      </w:r>
+    </w:p>
+    <w:p>
+      <w:r>
+        <w:t>image credit: (</w:t>
+      </w:r>
+      <w:r>
+        <w:t>The Boule Developers</w:t>
+      </w:r>
+      <w:r>
+        <w:t xml:space="preserve"> </w:t>
+      </w:r>
+      <w:r>
+        <w:t>Copyright 2019-2021</w:t>
+      </w:r>
+      <w:r>
+        <w:t>)</w:t>
+      </w:r>
+    </w:p>
+    <w:p>
+      <w:r>
+        <w:lastRenderedPageBreak/>
+        <w:drawing>
+          <wp:inline distT="0" distB="0" distL="0" distR="0" wp14:anchorId="381E3729" wp14:editId="5A39FD07">
+            <wp:extent cx="5943600" cy="4083050"/>
+            <wp:effectExtent l="0" t="0" r="0" b="6350"/>
+            <wp:docPr id="1975846103" name="Picture 1"/>
+            <wp:cNvGraphicFramePr>
+              <a:graphicFrameLocks xmlns:a="http://schemas.openxmlformats.org/drawingml/2006/main" noChangeAspect="1"/>
+            </wp:cNvGraphicFramePr>
+            <a:graphic xmlns:a="http://schemas.openxmlformats.org/drawingml/2006/main">
+              <a:graphicData uri="http://schemas.openxmlformats.org/drawingml/2006/picture">
+                <pic:pic xmlns:pic="http://schemas.openxmlformats.org/drawingml/2006/picture">
+                  <pic:nvPicPr>
+                    <pic:cNvPr id="1975846103" name=""/>
+                    <pic:cNvPicPr/>
+                  </pic:nvPicPr>
+                  <pic:blipFill>
+                    <a:blip r:embed="rId11"/>
+                    <a:stretch>
+                      <a:fillRect/>
+                    </a:stretch>
+                  </pic:blipFill>
+                  <pic:spPr>
+                    <a:xfrm>
+                      <a:off x="0" y="0"/>
+                      <a:ext cx="5943600" cy="4083050"/>
+                    </a:xfrm>
+                    <a:prstGeom prst="rect">
+                      <a:avLst/>
+                    </a:prstGeom>
+                  </pic:spPr>
+                </pic:pic>
+              </a:graphicData>
+            </a:graphic>
+          </wp:inline>
+        </w:drawing>
+      </w:r>
+    </w:p>
+    <w:p>
+      <w:pPr>
+        <w:pStyle w:val="ListParagraph"/>
+        <w:numPr>
+          <w:ilvl w:val="0"/>
+          <w:numId w:val="3"/>
+        </w:numPr>
+      </w:pPr>
+      <w:r>
+        <w:t xml:space="preserve">Geocentric latitude (psi) </w:t>
+      </w:r>
+    </w:p>
+    <w:p>
+      <w:pPr>
+        <w:pStyle w:val="ListParagraph"/>
+        <w:numPr>
+          <w:ilvl w:val="1"/>
+          <w:numId w:val="3"/>
+        </w:numPr>
+      </w:pPr>
+      <w:r>
+        <w:t>Geocentric latitude is the angle between the equatorial plane and the line connecting the Earth’s center to the observer</w:t>
+      </w:r>
+    </w:p>
+    <w:p>
+      <w:pPr>
+        <w:pStyle w:val="ListParagraph"/>
+        <w:numPr>
+          <w:ilvl w:val="0"/>
+          <w:numId w:val="3"/>
+        </w:numPr>
+      </w:pPr>
+      <w:r>
+        <w:t xml:space="preserve">Geodetic Latitude (phi) </w:t>
+      </w:r>
+    </w:p>
+    <w:p>
+      <w:pPr>
+        <w:pStyle w:val="ListParagraph"/>
+        <w:numPr>
+          <w:ilvl w:val="1"/>
+          <w:numId w:val="3"/>
+        </w:numPr>
+      </w:pPr>
+      <w:r>
+        <w:t>Angle between the equatorial plane and the line normal (perpendicular) to the reference ellipsoid at the observer’s position</w:t>
+      </w:r>
+    </w:p>
+    <w:p>
+      <w:pPr>
+        <w:pStyle w:val="ListParagraph"/>
+        <w:numPr>
+          <w:ilvl w:val="0"/>
+          <w:numId w:val="3"/>
+        </w:numPr>
+      </w:pPr>
+      <w:r>
+        <w:t>Note that for most locations on Earth, psi =/= phi</w:t>
+      </w:r>
+    </w:p>
+    <w:p>
+      <w:pPr>
+        <w:pStyle w:val="ListParagraph"/>
+        <w:numPr>
+          <w:ilvl w:val="1"/>
+          <w:numId w:val="3"/>
+        </w:numPr>
+      </w:pPr>
+      <w:r>
+        <w:t xml:space="preserve">At the poles they coincide </w:t>
+      </w:r>
+    </w:p>
+    <w:p>
+      <w:pPr>
+        <w:pStyle w:val="ListParagraph"/>
+        <w:numPr>
+          <w:ilvl w:val="0"/>
+          <w:numId w:val="3"/>
+        </w:numPr>
+      </w:pPr>
+      <w:r>
+        <w:t xml:space="preserve">[insert </w:t>
+      </w:r>
+      <w:r>
+        <w:t>*</w:t>
+      </w:r>
+      <w:r>
+        <w:t>interactive</w:t>
+      </w:r>
+      <w:r>
+        <w:t xml:space="preserve"> model here of {geodetic vs geocentric}</w:t>
+      </w:r>
+      <w:r>
+        <w:t>]</w:t>
+      </w:r>
+    </w:p>
+    <w:p>
+      <w:pPr>
+        <w:pStyle w:val="ListParagraph"/>
+        <w:numPr>
+          <w:ilvl w:val="0"/>
+          <w:numId w:val="3"/>
+        </w:numPr>
+      </w:pPr>
+      <w:r>
+        <w:t>Geographic latitude supplied through our GPS and ordinary location lookup is generally geodetic latitude</w:t>
+      </w:r>
+    </w:p>
+    <w:p>
+      <w:pPr>
+        <w:pStyle w:val="ListParagraph"/>
+        <w:numPr>
+          <w:ilvl w:val="1"/>
+          <w:numId w:val="3"/>
+        </w:numPr>
+      </w:pPr>
+      <w:r>
+        <w:t>The SPA method provided by (</w:t>
+      </w:r>
+      <w:proofErr w:type="spellStart"/>
+      <w:r>
+        <w:t>reda</w:t>
+      </w:r>
+      <w:proofErr w:type="spellEnd"/>
+      <w:r>
+        <w:t xml:space="preserve"> and Andreas) calculates relative to the Earth’s center. </w:t>
+      </w:r>
+    </w:p>
+    <w:p>
+      <w:pPr>
+        <w:pStyle w:val="ListParagraph"/>
+        <w:numPr>
+          <w:ilvl w:val="2"/>
+          <w:numId w:val="3"/>
+        </w:numPr>
+      </w:pPr>
+      <w:proofErr w:type="gramStart"/>
+      <w:r>
+        <w:t>Thus</w:t>
+      </w:r>
+      <w:proofErr w:type="gramEnd"/>
+      <w:r>
+        <w:t xml:space="preserve"> the SPA implementation in this paper will need to account for the observer’s actual position on the ellipsoid (see topocentric correction)</w:t>
+      </w:r>
+    </w:p>
+    <w:p>
+      <w:pPr>
+        <w:pStyle w:val="Heading3"/>
+      </w:pPr>
+      <w:r>
+        <w:lastRenderedPageBreak/>
+        <w:t>Observer Elevation</w:t>
+      </w:r>
+    </w:p>
+    <w:p>
+      <w:pPr>
+        <w:pStyle w:val="ListParagraph"/>
+        <w:numPr>
+          <w:ilvl w:val="0"/>
+          <w:numId w:val="3"/>
+        </w:numPr>
+      </w:pPr>
+      <w:r>
+        <w:t>Latitude and Longitude only identify horizontal geographic position. We need the observer’s position in three-dimensional space</w:t>
+      </w:r>
+    </w:p>
+    <w:p>
+      <w:pPr>
+        <w:pStyle w:val="ListParagraph"/>
+        <w:numPr>
+          <w:ilvl w:val="0"/>
+          <w:numId w:val="3"/>
+        </w:numPr>
+      </w:pPr>
+      <w:r>
+        <w:t xml:space="preserve">Let </w:t>
+      </w:r>
+      <w:proofErr w:type="spellStart"/>
+      <w:r>
+        <w:t>z_ell</w:t>
+      </w:r>
+      <w:proofErr w:type="spellEnd"/>
+      <w:r>
+        <w:t xml:space="preserve"> = </w:t>
+      </w:r>
+      <w:proofErr w:type="gramStart"/>
+      <w:r>
+        <w:t>observer’s</w:t>
+      </w:r>
+      <w:proofErr w:type="gramEnd"/>
+      <w:r>
+        <w:t xml:space="preserve"> </w:t>
+      </w:r>
+      <w:proofErr w:type="spellStart"/>
+      <w:r>
+        <w:t>hight</w:t>
+      </w:r>
+      <w:proofErr w:type="spellEnd"/>
+      <w:r>
+        <w:t xml:space="preserve"> above the reference ellipsoid</w:t>
+      </w:r>
+    </w:p>
+    <w:p>
+      <w:pPr>
+        <w:pStyle w:val="ListParagraph"/>
+        <w:numPr>
+          <w:ilvl w:val="0"/>
+          <w:numId w:val="3"/>
+        </w:numPr>
+      </w:pPr>
+      <w:r>
+        <w:t xml:space="preserve">The complete geodetic position becomes P = (phi, lambda, </w:t>
+      </w:r>
+      <w:proofErr w:type="spellStart"/>
+      <w:r>
+        <w:t>z_ell</w:t>
+      </w:r>
+      <w:proofErr w:type="spellEnd"/>
+      <w:r>
+        <w:t>)</w:t>
+      </w:r>
+    </w:p>
+    <w:p>
+      <w:pPr>
+        <w:pStyle w:val="ListParagraph"/>
+        <w:numPr>
+          <w:ilvl w:val="0"/>
+          <w:numId w:val="3"/>
+        </w:numPr>
+      </w:pPr>
+      <w:r>
+        <w:t>Geodetic height is measured along the ellipsoid normal</w:t>
+      </w:r>
+    </w:p>
+    <w:p>
+      <w:pPr>
+        <w:pStyle w:val="ListParagraph"/>
+        <w:numPr>
+          <w:ilvl w:val="0"/>
+          <w:numId w:val="3"/>
+        </w:numPr>
+      </w:pPr>
+      <w:r>
+        <w:t>Different from height above mean sea level*</w:t>
+      </w:r>
+    </w:p>
+    <w:p>
+      <w:pPr>
+        <w:pStyle w:val="ListParagraph"/>
+        <w:numPr>
+          <w:ilvl w:val="0"/>
+          <w:numId w:val="3"/>
+        </w:numPr>
+      </w:pPr>
+      <w:r>
+        <w:t>Elevation affects the observer’s position relative to the Earth’s center (</w:t>
+      </w:r>
+      <w:proofErr w:type="spellStart"/>
+      <w:r>
+        <w:t>ie</w:t>
+      </w:r>
+      <w:proofErr w:type="spellEnd"/>
+      <w:r>
+        <w:t>. Affects the topocentric correction)</w:t>
+      </w:r>
+    </w:p>
+    <w:p>
+      <w:pPr>
+        <w:pStyle w:val="ListParagraph"/>
+        <w:numPr>
+          <w:ilvl w:val="0"/>
+          <w:numId w:val="3"/>
+        </w:numPr>
+      </w:pPr>
+      <w:r>
+        <w:t xml:space="preserve">An elevated observer may see a more distant, lower apparent horizon than an observer at sea level </w:t>
+      </w:r>
+    </w:p>
+    <w:p>
+      <w:pPr>
+        <w:pStyle w:val="ListParagraph"/>
+        <w:numPr>
+          <w:ilvl w:val="1"/>
+          <w:numId w:val="3"/>
+        </w:numPr>
+      </w:pPr>
+      <w:r>
+        <w:t xml:space="preserve">Ex. </w:t>
+      </w:r>
+      <w:r>
+        <w:t xml:space="preserve">The top of the Burj Khalifa has a later sunset than </w:t>
+      </w:r>
+      <w:proofErr w:type="gramStart"/>
+      <w:r>
+        <w:t>the  ground</w:t>
+      </w:r>
+      <w:proofErr w:type="gramEnd"/>
+      <w:r>
+        <w:t xml:space="preserve"> floor</w:t>
+      </w:r>
+    </w:p>
+    <w:p>
+      <w:pPr>
+        <w:pStyle w:val="ListParagraph"/>
+        <w:numPr>
+          <w:ilvl w:val="0"/>
+          <w:numId w:val="3"/>
+        </w:numPr>
+      </w:pPr>
+      <w:r>
+        <w:t xml:space="preserve">This may be a separate consideration for Sunrise and Sunset. For the purposes of this application, we will treat observer </w:t>
+      </w:r>
+      <w:proofErr w:type="spellStart"/>
+      <w:r>
+        <w:t>elecation</w:t>
+      </w:r>
+      <w:proofErr w:type="spellEnd"/>
+      <w:r>
+        <w:t xml:space="preserve"> as an optional parameter and subject to a scholarly assumption (see section 3 Islamic Orientation subsection …)</w:t>
+      </w:r>
+    </w:p>
+    <w:p>
+      <w:pPr>
+        <w:pStyle w:val="Heading3"/>
+      </w:pPr>
+      <w:r>
+        <w:t>The local reference frame: Zenith and Horizon</w:t>
+      </w:r>
+    </w:p>
+    <w:p>
+      <w:pPr>
+        <w:pStyle w:val="ListParagraph"/>
+        <w:numPr>
+          <w:ilvl w:val="0"/>
+          <w:numId w:val="3"/>
+        </w:numPr>
+      </w:pPr>
+      <w:r>
+        <w:t>Now that we have a position P on the Earth, what exactly does it mean for the Sun to be above or below the horizon?</w:t>
+      </w:r>
+    </w:p>
     <w:p/>
     <w:p>
       <w:pPr>
         <w:pStyle w:val="Heading1"/>
       </w:pPr>
-      <w:r>
-        <w:t>Islamic Orientation</w:t>
+      <w:proofErr w:type="spellStart"/>
+      <w:r>
+        <w:t>Isla</w:t>
+      </w:r>
+      <w:proofErr w:type="spellEnd"/>
+      <w:r>
+        <w:t>mic Orientation</w:t>
       </w:r>
     </w:p>
     <w:p/>
@@ -555,33 +1561,33 @@
     </w:p>
     <w:p>
       <w:r>
+        <w:t xml:space="preserve">Asr - From the End of </w:t>
+      </w:r>
+      <w:proofErr w:type="spellStart"/>
+      <w:r>
+        <w:t>Dhuhr</w:t>
+      </w:r>
+      <w:proofErr w:type="spellEnd"/>
+      <w:r>
+        <w:t xml:space="preserve"> until just before Sunset (we will leave 5 minutes between the end of Asr and the beginning of Maghrib)</w:t>
+      </w:r>
+    </w:p>
+    <w:p>
+      <w:r>
+        <w:t>Maghrib - Just after sunset until the red twilight (</w:t>
+      </w:r>
+      <w:proofErr w:type="spellStart"/>
+      <w:r>
+        <w:t>shafaq</w:t>
+      </w:r>
+      <w:proofErr w:type="spellEnd"/>
+      <w:r>
+        <w:t>) or afterglow fades from the sky</w:t>
+      </w:r>
+    </w:p>
+    <w:p>
+      <w:r>
         <w:lastRenderedPageBreak/>
-        <w:t xml:space="preserve">Asr - From the End of </w:t>
-      </w:r>
-      <w:proofErr w:type="spellStart"/>
-      <w:r>
-        <w:t>Dhuhr</w:t>
-      </w:r>
-      <w:proofErr w:type="spellEnd"/>
-      <w:r>
-        <w:t xml:space="preserve"> until just before Sunset (we will leave 5 minutes between the end of Asr and the beginning of Maghrib)</w:t>
-      </w:r>
-    </w:p>
-    <w:p>
-      <w:r>
-        <w:t>Maghrib - Just after sunset until the red twilight (</w:t>
-      </w:r>
-      <w:proofErr w:type="spellStart"/>
-      <w:r>
-        <w:t>shafaq</w:t>
-      </w:r>
-      <w:proofErr w:type="spellEnd"/>
-      <w:r>
-        <w:t>) or afterglow fades from the sky</w:t>
-      </w:r>
-    </w:p>
-    <w:p>
-      <w:r>
         <w:t>Isha - When the red twilight (</w:t>
       </w:r>
       <w:proofErr w:type="spellStart"/>
@@ -2333,7 +3339,7 @@
 </file>
 
 <file path=customXml/itemProps1.xml><?xml version="1.0" encoding="utf-8"?>
-<ds:datastoreItem xmlns:ds="http://schemas.openxmlformats.org/officeDocument/2006/customXml" ds:itemID="{871C3BD5-5DAB-3A4B-ADC1-BAD9DE937C24}">
+<ds:datastoreItem xmlns:ds="http://schemas.openxmlformats.org/officeDocument/2006/customXml" ds:itemID="{0FAFA4C8-1D4A-C143-81F5-234874E5B79C}">
   <ds:schemaRefs>
     <ds:schemaRef ds:uri="http://schemas.openxmlformats.org/officeDocument/2006/bibliography"/>
   </ds:schemaRefs>

</xml_diff>

<commit_message>
added notes on local zenith and horizon
</commit_message>
<xml_diff>
--- a/docs/A Mathematical Model for Determining the Five Daily Islamic Prayer Times.docx
+++ b/docs/A Mathematical Model for Determining the Five Daily Islamic Prayer Times.docx
@@ -150,15 +150,7 @@
         <w:t xml:space="preserve">Before we can determine the Sun’s position relative to an observer, we need to define the observer’s position in a </w:t>
       </w:r>
       <w:r>
-        <w:t xml:space="preserve">consistent (and mathematically </w:t>
-      </w:r>
-      <w:proofErr w:type="spellStart"/>
-      <w:r>
-        <w:t>sound) coordinate</w:t>
-      </w:r>
-      <w:proofErr w:type="spellEnd"/>
-      <w:r>
-        <w:t xml:space="preserve"> system</w:t>
+        <w:t>consistent (and mathematically sound) coordinate system</w:t>
       </w:r>
     </w:p>
     <w:p>
@@ -238,15 +230,7 @@
         </w:numPr>
       </w:pPr>
       <w:r>
-        <w:t xml:space="preserve">Oblate Spheroid is a sphere flattened slightly at the poles and wider around the equator. This is </w:t>
-      </w:r>
-      <w:proofErr w:type="gramStart"/>
-      <w:r>
-        <w:t>due to the effect</w:t>
-      </w:r>
-      <w:proofErr w:type="gramEnd"/>
-      <w:r>
-        <w:t xml:space="preserve"> of gravity </w:t>
+        <w:t xml:space="preserve">Oblate Spheroid is a sphere flattened slightly at the poles and wider around the equator. This is due to the effect of gravity </w:t>
       </w:r>
       <w:r>
         <w:t>on the Earth</w:t>
@@ -449,12 +433,36 @@
       <w:pPr>
         <w:pStyle w:val="ListParagraph"/>
         <w:numPr>
+          <w:ilvl w:val="1"/>
+          <w:numId w:val="3"/>
+        </w:numPr>
+      </w:pPr>
+      <w:r>
+        <w:t>https://earth-info.nga.mil/?action=wgs84&amp;dir=wgs84</w:t>
+      </w:r>
+    </w:p>
+    <w:p>
+      <w:pPr>
+        <w:pStyle w:val="ListParagraph"/>
+        <w:numPr>
           <w:ilvl w:val="0"/>
           <w:numId w:val="3"/>
         </w:numPr>
       </w:pPr>
       <w:r>
         <w:t>Note that compared to the SPA, Reda and Andreas account for flattening when calculating the Sun’s topocentric position. The SPA constants vary slightly from the exact WGS 84 parameters</w:t>
+      </w:r>
+    </w:p>
+    <w:p>
+      <w:pPr>
+        <w:pStyle w:val="ListParagraph"/>
+        <w:numPr>
+          <w:ilvl w:val="1"/>
+          <w:numId w:val="3"/>
+        </w:numPr>
+      </w:pPr>
+      <w:r>
+        <w:t>https://docs.nlr.gov/docs/fy08osti/34302.pdf</w:t>
       </w:r>
     </w:p>
     <w:p>
@@ -605,68 +613,31 @@
         </w:numPr>
       </w:pPr>
       <w:r>
-        <w:t xml:space="preserve"> phi = geographic latitude (North +</w:t>
-      </w:r>
-      <w:proofErr w:type="spellStart"/>
-      <w:r>
-        <w:t>ve</w:t>
-      </w:r>
-      <w:proofErr w:type="spellEnd"/>
-      <w:r>
-        <w:t>, south -</w:t>
-      </w:r>
-      <w:proofErr w:type="spellStart"/>
-      <w:r>
-        <w:t>ve</w:t>
-      </w:r>
-      <w:proofErr w:type="spellEnd"/>
-      <w:r>
-        <w:t>)</w:t>
-      </w:r>
-    </w:p>
-    <w:p>
-      <w:pPr>
-        <w:pStyle w:val="ListParagraph"/>
-        <w:numPr>
-          <w:ilvl w:val="1"/>
-          <w:numId w:val="3"/>
-        </w:numPr>
-      </w:pPr>
-      <w:r>
-        <w:t>Lambda = geographic longitude (East +</w:t>
-      </w:r>
-      <w:proofErr w:type="spellStart"/>
-      <w:r>
-        <w:t>ve</w:t>
-      </w:r>
-      <w:proofErr w:type="spellEnd"/>
-      <w:r>
-        <w:t>, west -</w:t>
-      </w:r>
-      <w:proofErr w:type="spellStart"/>
-      <w:r>
-        <w:t>ve</w:t>
-      </w:r>
-      <w:proofErr w:type="spellEnd"/>
-      <w:r>
-        <w:t>)</w:t>
-      </w:r>
-    </w:p>
-    <w:p>
-      <w:pPr>
-        <w:pStyle w:val="ListParagraph"/>
-        <w:numPr>
-          <w:ilvl w:val="0"/>
-          <w:numId w:val="3"/>
-        </w:numPr>
-      </w:pPr>
-      <w:proofErr w:type="spellStart"/>
-      <w:r>
-        <w:t>Lattitude</w:t>
-      </w:r>
-      <w:proofErr w:type="spellEnd"/>
-      <w:r>
-        <w:t xml:space="preserve"> (phi) </w:t>
+        <w:t xml:space="preserve"> phi = geographic latitude (North +ve, south -ve)</w:t>
+      </w:r>
+    </w:p>
+    <w:p>
+      <w:pPr>
+        <w:pStyle w:val="ListParagraph"/>
+        <w:numPr>
+          <w:ilvl w:val="1"/>
+          <w:numId w:val="3"/>
+        </w:numPr>
+      </w:pPr>
+      <w:r>
+        <w:t>Lambda = geographic longitude (East +ve, west -ve)</w:t>
+      </w:r>
+    </w:p>
+    <w:p>
+      <w:pPr>
+        <w:pStyle w:val="ListParagraph"/>
+        <w:numPr>
+          <w:ilvl w:val="0"/>
+          <w:numId w:val="3"/>
+        </w:numPr>
+      </w:pPr>
+      <w:r>
+        <w:t xml:space="preserve">Lattitude (phi) </w:t>
       </w:r>
     </w:p>
     <w:p>
@@ -734,6 +705,18 @@
       <w:pPr>
         <w:pStyle w:val="ListParagraph"/>
         <w:numPr>
+          <w:ilvl w:val="1"/>
+          <w:numId w:val="3"/>
+        </w:numPr>
+      </w:pPr>
+      <w:r>
+        <w:t>https://oceanservice.noaa.gov/facts/latitude.html</w:t>
+      </w:r>
+    </w:p>
+    <w:p>
+      <w:pPr>
+        <w:pStyle w:val="ListParagraph"/>
+        <w:numPr>
           <w:ilvl w:val="0"/>
           <w:numId w:val="3"/>
         </w:numPr>
@@ -750,13 +733,8 @@
           <w:numId w:val="3"/>
         </w:numPr>
       </w:pPr>
-      <w:proofErr w:type="spellStart"/>
-      <w:r>
-        <w:t>Speficies</w:t>
-      </w:r>
-      <w:proofErr w:type="spellEnd"/>
-      <w:r>
-        <w:t xml:space="preserve"> the east-west angular position of a location relative to a reference meridian</w:t>
+      <w:r>
+        <w:t>Speficies the east-west angular position of a location relative to a reference meridian</w:t>
       </w:r>
     </w:p>
     <w:p>
@@ -792,15 +770,7 @@
         </w:numPr>
       </w:pPr>
       <w:r>
-        <w:t xml:space="preserve">Longitude is not an angle </w:t>
-      </w:r>
-      <w:proofErr w:type="spellStart"/>
-      <w:r>
-        <w:t>measurd</w:t>
-      </w:r>
-      <w:proofErr w:type="spellEnd"/>
-      <w:r>
-        <w:t xml:space="preserve"> along Earth’s curved surface</w:t>
+        <w:t>Longitude is not an angle measurd along Earth’s curved surface</w:t>
       </w:r>
     </w:p>
     <w:p>
@@ -815,23 +785,7 @@
         <w:t>It is an angular separation between meridian planes</w:t>
       </w:r>
       <w:r>
-        <w:t xml:space="preserve"> (cite </w:t>
-      </w:r>
-      <w:proofErr w:type="spellStart"/>
-      <w:r>
-        <w:t>reda</w:t>
-      </w:r>
-      <w:proofErr w:type="spellEnd"/>
-      <w:r>
-        <w:t xml:space="preserve"> &amp; </w:t>
-      </w:r>
-      <w:proofErr w:type="spellStart"/>
-      <w:r>
-        <w:t>andreas</w:t>
-      </w:r>
-      <w:proofErr w:type="spellEnd"/>
-      <w:r>
-        <w:t xml:space="preserve"> here)</w:t>
+        <w:t xml:space="preserve"> (cite reda &amp; andreas here)</w:t>
       </w:r>
     </w:p>
     <w:p>
@@ -897,15 +851,7 @@
         </w:numPr>
       </w:pPr>
       <w:r>
-        <w:t xml:space="preserve">The Sun will have different hour angles relative to the </w:t>
-      </w:r>
-      <w:proofErr w:type="gramStart"/>
-      <w:r>
-        <w:t>observers</w:t>
-      </w:r>
-      <w:proofErr w:type="gramEnd"/>
-      <w:r>
-        <w:t xml:space="preserve"> position</w:t>
+        <w:t>The Sun will have different hour angles relative to the observers position</w:t>
       </w:r>
     </w:p>
     <w:p>
@@ -941,31 +887,7 @@
         </w:numPr>
       </w:pPr>
       <w:r>
-        <w:t xml:space="preserve">Note that the earth’s orbital motion is also not a perfect sphere and is </w:t>
-      </w:r>
-      <w:proofErr w:type="spellStart"/>
-      <w:r>
-        <w:t>infact</w:t>
-      </w:r>
-      <w:proofErr w:type="spellEnd"/>
-      <w:r>
-        <w:t xml:space="preserve"> another ellipsoid. </w:t>
-      </w:r>
-      <w:proofErr w:type="gramStart"/>
-      <w:r>
-        <w:t>Thus</w:t>
-      </w:r>
-      <w:proofErr w:type="gramEnd"/>
-      <w:r>
-        <w:t xml:space="preserve"> the duration of apparent solar days </w:t>
-      </w:r>
-      <w:proofErr w:type="gramStart"/>
-      <w:r>
-        <w:t>varies</w:t>
-      </w:r>
-      <w:proofErr w:type="gramEnd"/>
-      <w:r>
-        <w:t xml:space="preserve"> and the above relationship is not always correct</w:t>
+        <w:t>Note that the earth’s orbital motion is also not a perfect sphere and is infact another ellipsoid. Thus the duration of apparent solar days varies and the above relationship is not always correct</w:t>
       </w:r>
     </w:p>
     <w:p>
@@ -997,15 +919,7 @@
         </w:numPr>
       </w:pPr>
       <w:r>
-        <w:t xml:space="preserve">Up to this </w:t>
-      </w:r>
-      <w:proofErr w:type="gramStart"/>
-      <w:r>
-        <w:t>point,  latitude</w:t>
-      </w:r>
-      <w:proofErr w:type="gramEnd"/>
-      <w:r>
-        <w:t xml:space="preserve"> has been something intuitive. However, due to the ellipsoidal nature of the Earth, there are two angles that are confused.</w:t>
+        <w:t>Up to this point,  latitude has been something intuitive. However, due to the ellipsoidal nature of the Earth, there are two angles that are confused.</w:t>
       </w:r>
     </w:p>
     <w:p>
@@ -1289,15 +1203,7 @@
         </w:numPr>
       </w:pPr>
       <w:r>
-        <w:t>The SPA method provided by (</w:t>
-      </w:r>
-      <w:proofErr w:type="spellStart"/>
-      <w:r>
-        <w:t>reda</w:t>
-      </w:r>
-      <w:proofErr w:type="spellEnd"/>
-      <w:r>
-        <w:t xml:space="preserve"> and Andreas) calculates relative to the Earth’s center. </w:t>
+        <w:t xml:space="preserve">The SPA method provided by (reda and Andreas) calculates relative to the Earth’s center. </w:t>
       </w:r>
     </w:p>
     <w:p>
@@ -1308,13 +1214,8 @@
           <w:numId w:val="3"/>
         </w:numPr>
       </w:pPr>
-      <w:proofErr w:type="gramStart"/>
-      <w:r>
-        <w:t>Thus</w:t>
-      </w:r>
-      <w:proofErr w:type="gramEnd"/>
-      <w:r>
-        <w:t xml:space="preserve"> the SPA implementation in this paper will need to account for the observer’s actual position on the ellipsoid (see topocentric correction)</w:t>
+      <w:r>
+        <w:t>Thus the SPA implementation in this paper will need to account for the observer’s actual position on the ellipsoid (see topocentric correction)</w:t>
       </w:r>
     </w:p>
     <w:p>
@@ -1347,51 +1248,19 @@
         </w:numPr>
       </w:pPr>
       <w:r>
-        <w:t xml:space="preserve">Let </w:t>
-      </w:r>
-      <w:proofErr w:type="spellStart"/>
-      <w:r>
-        <w:t>z_ell</w:t>
-      </w:r>
-      <w:proofErr w:type="spellEnd"/>
-      <w:r>
-        <w:t xml:space="preserve"> = </w:t>
-      </w:r>
-      <w:proofErr w:type="gramStart"/>
-      <w:r>
-        <w:t>observer’s</w:t>
-      </w:r>
-      <w:proofErr w:type="gramEnd"/>
-      <w:r>
-        <w:t xml:space="preserve"> </w:t>
-      </w:r>
-      <w:proofErr w:type="spellStart"/>
-      <w:r>
-        <w:t>hight</w:t>
-      </w:r>
-      <w:proofErr w:type="spellEnd"/>
-      <w:r>
-        <w:t xml:space="preserve"> above the reference ellipsoid</w:t>
-      </w:r>
-    </w:p>
-    <w:p>
-      <w:pPr>
-        <w:pStyle w:val="ListParagraph"/>
-        <w:numPr>
-          <w:ilvl w:val="0"/>
-          <w:numId w:val="3"/>
-        </w:numPr>
-      </w:pPr>
-      <w:r>
-        <w:t xml:space="preserve">The complete geodetic position becomes P = (phi, lambda, </w:t>
-      </w:r>
-      <w:proofErr w:type="spellStart"/>
-      <w:r>
-        <w:t>z_ell</w:t>
-      </w:r>
-      <w:proofErr w:type="spellEnd"/>
-      <w:r>
-        <w:t>)</w:t>
+        <w:t>Let z_ell = observer’s hight above the reference ellipsoid</w:t>
+      </w:r>
+    </w:p>
+    <w:p>
+      <w:pPr>
+        <w:pStyle w:val="ListParagraph"/>
+        <w:numPr>
+          <w:ilvl w:val="0"/>
+          <w:numId w:val="3"/>
+        </w:numPr>
+      </w:pPr>
+      <w:r>
+        <w:t>The complete geodetic position becomes P = (phi, lambda, z_ell)</w:t>
       </w:r>
     </w:p>
     <w:p>
@@ -1427,15 +1296,7 @@
         </w:numPr>
       </w:pPr>
       <w:r>
-        <w:t>Elevation affects the observer’s position relative to the Earth’s center (</w:t>
-      </w:r>
-      <w:proofErr w:type="spellStart"/>
-      <w:r>
-        <w:t>ie</w:t>
-      </w:r>
-      <w:proofErr w:type="spellEnd"/>
-      <w:r>
-        <w:t>. Affects the topocentric correction)</w:t>
+        <w:t>Elevation affects the observer’s position relative to the Earth’s center (ie. Affects the topocentric correction)</w:t>
       </w:r>
     </w:p>
     <w:p>
@@ -1462,35 +1323,19 @@
         <w:t xml:space="preserve">Ex. </w:t>
       </w:r>
       <w:r>
-        <w:t xml:space="preserve">The top of the Burj Khalifa has a later sunset than </w:t>
-      </w:r>
-      <w:proofErr w:type="gramStart"/>
-      <w:r>
-        <w:t>the  ground</w:t>
-      </w:r>
-      <w:proofErr w:type="gramEnd"/>
-      <w:r>
-        <w:t xml:space="preserve"> floor</w:t>
-      </w:r>
-    </w:p>
-    <w:p>
-      <w:pPr>
-        <w:pStyle w:val="ListParagraph"/>
-        <w:numPr>
-          <w:ilvl w:val="0"/>
-          <w:numId w:val="3"/>
-        </w:numPr>
-      </w:pPr>
-      <w:r>
-        <w:t xml:space="preserve">This may be a separate consideration for Sunrise and Sunset. For the purposes of this application, we will treat observer </w:t>
-      </w:r>
-      <w:proofErr w:type="spellStart"/>
-      <w:r>
-        <w:t>elecation</w:t>
-      </w:r>
-      <w:proofErr w:type="spellEnd"/>
-      <w:r>
-        <w:t xml:space="preserve"> as an optional parameter and subject to a scholarly assumption (see section 3 Islamic Orientation subsection …)</w:t>
+        <w:t>The top of the Burj Khalifa has a later sunset than the  ground floor</w:t>
+      </w:r>
+    </w:p>
+    <w:p>
+      <w:pPr>
+        <w:pStyle w:val="ListParagraph"/>
+        <w:numPr>
+          <w:ilvl w:val="0"/>
+          <w:numId w:val="3"/>
+        </w:numPr>
+      </w:pPr>
+      <w:r>
+        <w:t>This may be a separate consideration for Sunrise and Sunset. For the purposes of this application, we will treat observer elecation as an optional parameter and subject to a scholarly assumption (see section 3 Islamic Orientation subsection …)</w:t>
       </w:r>
     </w:p>
     <w:p>
@@ -1513,18 +1358,248 @@
         <w:t>Now that we have a position P on the Earth, what exactly does it mean for the Sun to be above or below the horizon?</w:t>
       </w:r>
     </w:p>
+    <w:p>
+      <w:pPr>
+        <w:pStyle w:val="ListParagraph"/>
+        <w:numPr>
+          <w:ilvl w:val="0"/>
+          <w:numId w:val="3"/>
+        </w:numPr>
+      </w:pPr>
+      <w:r>
+        <w:t>To answer this, it is best to establish a local coordinate system.</w:t>
+      </w:r>
+    </w:p>
+    <w:p>
+      <w:pPr>
+        <w:pStyle w:val="ListParagraph"/>
+        <w:numPr>
+          <w:ilvl w:val="0"/>
+          <w:numId w:val="3"/>
+        </w:numPr>
+      </w:pPr>
+      <w:r>
+        <w:t xml:space="preserve">The Zenith is the direction directly above the observer. </w:t>
+      </w:r>
+    </w:p>
+    <w:p>
+      <w:pPr>
+        <w:pStyle w:val="ListParagraph"/>
+        <w:numPr>
+          <w:ilvl w:val="1"/>
+          <w:numId w:val="3"/>
+        </w:numPr>
+      </w:pPr>
+      <w:r>
+        <w:t>In the geodetic model, we use the outward normal to the reference ellipsoid as our nominal zenith direction</w:t>
+      </w:r>
+    </w:p>
+    <w:p>
+      <w:pPr>
+        <w:pStyle w:val="ListParagraph"/>
+        <w:numPr>
+          <w:ilvl w:val="1"/>
+          <w:numId w:val="3"/>
+        </w:numPr>
+      </w:pPr>
+      <w:r>
+        <w:t>[diagram]</w:t>
+      </w:r>
+    </w:p>
+    <w:p>
+      <w:pPr>
+        <w:pStyle w:val="ListParagraph"/>
+        <w:numPr>
+          <w:ilvl w:val="1"/>
+          <w:numId w:val="3"/>
+        </w:numPr>
+      </w:pPr>
+      <w:r>
+        <w:t>The local horizontal plane is perpendicular to this direction</w:t>
+      </w:r>
+    </w:p>
+    <w:p>
+      <w:pPr>
+        <w:pStyle w:val="ListParagraph"/>
+        <w:numPr>
+          <w:ilvl w:val="0"/>
+          <w:numId w:val="3"/>
+        </w:numPr>
+      </w:pPr>
+      <w:r>
+        <w:t>Consider a three-dimensional, Earth-Centered, Earth-fixed cartesian coordinate system with:</w:t>
+      </w:r>
+    </w:p>
+    <w:p>
+      <w:pPr>
+        <w:pStyle w:val="ListParagraph"/>
+        <w:numPr>
+          <w:ilvl w:val="1"/>
+          <w:numId w:val="3"/>
+        </w:numPr>
+      </w:pPr>
+      <w:r>
+        <w:t>X directed toward the reference meridian of the equator</w:t>
+      </w:r>
+    </w:p>
+    <w:p>
+      <w:pPr>
+        <w:pStyle w:val="ListParagraph"/>
+        <w:numPr>
+          <w:ilvl w:val="1"/>
+          <w:numId w:val="3"/>
+        </w:numPr>
+      </w:pPr>
+      <w:r>
+        <w:t>Y completing the right handed equatorial coordinate system</w:t>
+      </w:r>
+    </w:p>
+    <w:p>
+      <w:pPr>
+        <w:pStyle w:val="ListParagraph"/>
+        <w:numPr>
+          <w:ilvl w:val="1"/>
+          <w:numId w:val="3"/>
+        </w:numPr>
+      </w:pPr>
+      <w:r>
+        <w:t>Z directed towards the north pole</w:t>
+      </w:r>
+    </w:p>
+    <w:p>
+      <w:pPr>
+        <w:pStyle w:val="ListParagraph"/>
+        <w:numPr>
+          <w:ilvl w:val="0"/>
+          <w:numId w:val="3"/>
+        </w:numPr>
+      </w:pPr>
+      <w:r>
+        <w:t>Then for geodetic latitude phi and longitude lambda we have</w:t>
+      </w:r>
+    </w:p>
+    <w:p>
+      <w:pPr>
+        <w:pStyle w:val="ListParagraph"/>
+        <w:numPr>
+          <w:ilvl w:val="0"/>
+          <w:numId w:val="3"/>
+        </w:numPr>
+      </w:pPr>
+      <w:r>
+        <w:t>n = unit vector along the ellipsoid normal</w:t>
+      </w:r>
+    </w:p>
+    <w:p>
+      <w:pPr>
+        <w:pStyle w:val="ListParagraph"/>
+        <w:numPr>
+          <w:ilvl w:val="1"/>
+          <w:numId w:val="3"/>
+        </w:numPr>
+      </w:pPr>
+      <w:r>
+        <w:t>(cos(phi)*cos(lambda), cos(phi)*sin(lambda), sin(phi))</w:t>
+      </w:r>
+    </w:p>
+    <w:p>
+      <w:pPr>
+        <w:pStyle w:val="ListParagraph"/>
+        <w:numPr>
+          <w:ilvl w:val="2"/>
+          <w:numId w:val="3"/>
+        </w:numPr>
+      </w:pPr>
+      <w:r>
+        <w:t>[</w:t>
+      </w:r>
+      <w:r>
+        <w:t xml:space="preserve">something to </w:t>
+      </w:r>
+      <w:r>
+        <w:t>illustrate these derivations]</w:t>
+      </w:r>
+    </w:p>
+    <w:p>
+      <w:pPr>
+        <w:pStyle w:val="ListParagraph"/>
+        <w:numPr>
+          <w:ilvl w:val="1"/>
+          <w:numId w:val="3"/>
+        </w:numPr>
+      </w:pPr>
+      <w:r>
+        <w:t>The vertical component Z is simply sin(phi)</w:t>
+      </w:r>
+    </w:p>
+    <w:p>
+      <w:pPr>
+        <w:pStyle w:val="ListParagraph"/>
+        <w:numPr>
+          <w:ilvl w:val="1"/>
+          <w:numId w:val="3"/>
+        </w:numPr>
+      </w:pPr>
+      <w:r>
+        <w:t>Ther vertical component Z’s magnitude projected onto the equatorial plane is cos(phi)</w:t>
+      </w:r>
+    </w:p>
+    <w:p>
+      <w:pPr>
+        <w:pStyle w:val="ListParagraph"/>
+        <w:numPr>
+          <w:ilvl w:val="1"/>
+          <w:numId w:val="3"/>
+        </w:numPr>
+      </w:pPr>
+      <w:r>
+        <w:lastRenderedPageBreak/>
+        <w:t>Longitude divides that horizontal projection into its X and Y components using cosine and sine</w:t>
+      </w:r>
+    </w:p>
+    <w:p>
+      <w:pPr>
+        <w:pStyle w:val="ListParagraph"/>
+        <w:numPr>
+          <w:ilvl w:val="0"/>
+          <w:numId w:val="3"/>
+        </w:numPr>
+      </w:pPr>
+      <w:r>
+        <w:t>We can prove n is a unit vector (proof left as an exercise for the reader)</w:t>
+      </w:r>
+    </w:p>
+    <w:p>
+      <w:pPr>
+        <w:pStyle w:val="ListParagraph"/>
+        <w:numPr>
+          <w:ilvl w:val="0"/>
+          <w:numId w:val="3"/>
+        </w:numPr>
+      </w:pPr>
+      <w:r>
+        <w:t>This unit vector now encodes the physical location of the observer and determines the orientation of the local geodetic zenith (observer-perceived straight up) and perpendicular to that, the local horizontal plane (observer-perceived horizon)</w:t>
+      </w:r>
+    </w:p>
+    <w:p>
+      <w:pPr>
+        <w:pStyle w:val="ListParagraph"/>
+        <w:numPr>
+          <w:ilvl w:val="0"/>
+          <w:numId w:val="3"/>
+        </w:numPr>
+      </w:pPr>
+      <w:r>
+        <w:t>[big diagram here]</w:t>
+      </w:r>
+    </w:p>
     <w:p/>
     <w:p>
       <w:pPr>
         <w:pStyle w:val="Heading1"/>
       </w:pPr>
-      <w:proofErr w:type="spellStart"/>
-      <w:r>
-        <w:t>Isla</w:t>
-      </w:r>
-      <w:proofErr w:type="spellEnd"/>
-      <w:r>
-        <w:t>mic Orientation</w:t>
+      <w:r>
+        <w:t>Islamic Orientation</w:t>
       </w:r>
     </w:p>
     <w:p/>
@@ -1534,69 +1609,23 @@
       </w:r>
     </w:p>
     <w:p>
-      <w:proofErr w:type="spellStart"/>
-      <w:r>
-        <w:t>Dhuhr</w:t>
-      </w:r>
-      <w:proofErr w:type="spellEnd"/>
-      <w:r>
-        <w:t xml:space="preserve"> </w:t>
-      </w:r>
-      <w:proofErr w:type="gramStart"/>
-      <w:r>
-        <w:t>-  It</w:t>
-      </w:r>
-      <w:proofErr w:type="gramEnd"/>
-      <w:r>
-        <w:t xml:space="preserve"> begins shortly after the sun reaches its highest point in the sky (zenith/meridian) and starts to decline, casting a slight shadow to the east. Ends when the shadow of an object grows to be equal in length to the object itself (or doubles in length depending on the legal school or Madhab). views (</w:t>
-      </w:r>
-      <w:proofErr w:type="spellStart"/>
-      <w:r>
-        <w:t>hanafi</w:t>
-      </w:r>
-      <w:proofErr w:type="spellEnd"/>
-      <w:r>
-        <w:t xml:space="preserve"> =&gt; double length, Shafi'i =&gt; single length) I want to support both </w:t>
-      </w:r>
-    </w:p>
-    <w:p>
-      <w:r>
-        <w:t xml:space="preserve">Asr - From the End of </w:t>
-      </w:r>
-      <w:proofErr w:type="spellStart"/>
-      <w:r>
-        <w:t>Dhuhr</w:t>
-      </w:r>
-      <w:proofErr w:type="spellEnd"/>
-      <w:r>
-        <w:t xml:space="preserve"> until just before Sunset (we will leave 5 minutes between the end of Asr and the beginning of Maghrib)</w:t>
-      </w:r>
-    </w:p>
-    <w:p>
-      <w:r>
-        <w:t>Maghrib - Just after sunset until the red twilight (</w:t>
-      </w:r>
-      <w:proofErr w:type="spellStart"/>
-      <w:r>
-        <w:t>shafaq</w:t>
-      </w:r>
-      <w:proofErr w:type="spellEnd"/>
-      <w:r>
-        <w:t>) or afterglow fades from the sky</w:t>
-      </w:r>
-    </w:p>
-    <w:p>
-      <w:r>
-        <w:lastRenderedPageBreak/>
-        <w:t>Isha - When the red twilight (</w:t>
-      </w:r>
-      <w:proofErr w:type="spellStart"/>
-      <w:r>
-        <w:t>shafaq</w:t>
-      </w:r>
-      <w:proofErr w:type="spellEnd"/>
-      <w:r>
-        <w:t>) or afterglow fades from the sky. Extends until the beginning of Fajr time</w:t>
+      <w:r>
+        <w:t xml:space="preserve">Dhuhr -  It begins shortly after the sun reaches its highest point in the sky (zenith/meridian) and starts to decline, casting a slight shadow to the east. Ends when the shadow of an object grows to be equal in length to the object itself (or doubles in length depending on the legal school or Madhab). views (hanafi =&gt; double length, Shafi'i =&gt; single length) I want to support both </w:t>
+      </w:r>
+    </w:p>
+    <w:p>
+      <w:r>
+        <w:t>Asr - From the End of Dhuhr until just before Sunset (we will leave 5 minutes between the end of Asr and the beginning of Maghrib)</w:t>
+      </w:r>
+    </w:p>
+    <w:p>
+      <w:r>
+        <w:t>Maghrib - Just after sunset until the red twilight (shafaq) or afterglow fades from the sky</w:t>
+      </w:r>
+    </w:p>
+    <w:p>
+      <w:r>
+        <w:t>Isha - When the red twilight (shafaq) or afterglow fades from the sky. Extends until the beginning of Fajr time</w:t>
       </w:r>
     </w:p>
     <w:sectPr>
@@ -3339,7 +3368,7 @@
 </file>
 
 <file path=customXml/itemProps1.xml><?xml version="1.0" encoding="utf-8"?>
-<ds:datastoreItem xmlns:ds="http://schemas.openxmlformats.org/officeDocument/2006/customXml" ds:itemID="{0FAFA4C8-1D4A-C143-81F5-234874E5B79C}">
+<ds:datastoreItem xmlns:ds="http://schemas.openxmlformats.org/officeDocument/2006/customXml" ds:itemID="{2C424A20-EB10-1943-8A74-0DD71E589549}">
   <ds:schemaRefs>
     <ds:schemaRef ds:uri="http://schemas.openxmlformats.org/officeDocument/2006/bibliography"/>
   </ds:schemaRefs>

</xml_diff>